<commit_message>
Added secrtions 3 and 5
</commit_message>
<xml_diff>
--- a/documentation/editables/03-Software-Architecture-Design.docx
+++ b/documentation/editables/03-Software-Architecture-Design.docx
@@ -70,7 +70,23 @@
         <w:pStyle w:val="InfoBlue"/>
       </w:pPr>
       <w:r>
-        <w:t>[Note: The following template is provided for use with the Unified Process for EDUcation. Text enclosed in square brackets and displayed in blue italics (style=InfoBlue) is included to provide guidance to the author and should be deleted before publishing the document. A paragraph entered following this style will automatically be set to normal (style=Body Text).]</w:t>
+        <w:t xml:space="preserve">[Note: The following template is provided for use with the Unified Process for </w:t>
+      </w:r>
+      <w:proofErr w:type="spellStart"/>
+      <w:r>
+        <w:t>EDUcation</w:t>
+      </w:r>
+      <w:proofErr w:type="spellEnd"/>
+      <w:r>
+        <w:t>. Text enclosed in square brackets and displayed in blue italics (style=</w:t>
+      </w:r>
+      <w:proofErr w:type="spellStart"/>
+      <w:r>
+        <w:t>InfoBlue</w:t>
+      </w:r>
+      <w:proofErr w:type="spellEnd"/>
+      <w:r>
+        <w:t>) is included to provide guidance to the author and should be deleted before publishing the document. A paragraph entered following this style will automatically be set to normal (style=Body Text).]</w:t>
       </w:r>
     </w:p>
     <w:p>
@@ -81,7 +97,15 @@
         </w:rPr>
       </w:pPr>
       <w:r>
-        <w:t xml:space="preserve">[To customize automatic fields in Microsoft Word (which display a gray background when selected), select File&gt;Properties and replace the Title, Subject and Company fields with the appropriate information for this document. After closing the dialog, automatic fields may be updated throughout the document by selecting Edit&gt;Select All (or Ctrl-A) and pressing F9, or simply click on the field and press F9.  This must be done separately for Headers and Footers.  Alt-F9 will toggle between displaying the field names and the field contents.  See Word help for more information on working with fields.]  </w:t>
+        <w:t xml:space="preserve">[To customize automatic fields in Microsoft Word (which display a gray background when selected), select File&gt;Properties and replace the Title, Subject and Company fields with the appropriate information for this document. After closing the dialog, automatic fields may be updated throughout the document by selecting Edit&gt;Select All (or Ctrl-A) and pressing </w:t>
+      </w:r>
+      <w:proofErr w:type="gramStart"/>
+      <w:r>
+        <w:t>F9, or</w:t>
+      </w:r>
+      <w:proofErr w:type="gramEnd"/>
+      <w:r>
+        <w:t xml:space="preserve"> simply click on the field and press F9.  This must be done separately for Headers and Footers.  Alt-F9 will toggle between displaying the field names and the field contents.  See Word help for more information on working with fields.]  </w:t>
       </w:r>
       <w:r>
         <w:rPr>
@@ -98,7 +122,21 @@
         <w:rPr>
           <w:highlight w:val="yellow"/>
         </w:rPr>
-        <w:t>that are OK to leave out.</w:t>
+        <w:t xml:space="preserve">that </w:t>
+      </w:r>
+      <w:proofErr w:type="gramStart"/>
+      <w:r>
+        <w:rPr>
+          <w:highlight w:val="yellow"/>
+        </w:rPr>
+        <w:t>are</w:t>
+      </w:r>
+      <w:proofErr w:type="gramEnd"/>
+      <w:r>
+        <w:rPr>
+          <w:highlight w:val="yellow"/>
+        </w:rPr>
+        <w:t xml:space="preserve"> OK to leave out.</w:t>
       </w:r>
     </w:p>
     <w:p>
@@ -397,8 +435,91 @@
             <w:pPr>
               <w:pStyle w:val="Tabletext"/>
             </w:pPr>
+            <w:proofErr w:type="spellStart"/>
             <w:r>
-              <w:t>Yecolia E.</w:t>
+              <w:t>Yecolia</w:t>
+            </w:r>
+            <w:proofErr w:type="spellEnd"/>
+            <w:r>
+              <w:t xml:space="preserve"> E.</w:t>
+            </w:r>
+          </w:p>
+        </w:tc>
+      </w:tr>
+      <w:tr>
+        <w:tc>
+          <w:tcPr>
+            <w:tcW w:w="2303" w:type="dxa"/>
+            <w:tcBorders>
+              <w:top w:val="single" w:sz="6" w:space="0" w:color="000000"/>
+              <w:left w:val="single" w:sz="6" w:space="0" w:color="000000"/>
+              <w:bottom w:val="single" w:sz="6" w:space="0" w:color="000000"/>
+              <w:right w:val="single" w:sz="6" w:space="0" w:color="000000"/>
+            </w:tcBorders>
+          </w:tcPr>
+          <w:p>
+            <w:pPr>
+              <w:pStyle w:val="Tabletext"/>
+            </w:pPr>
+            <w:r>
+              <w:t>9 April 2026</w:t>
+            </w:r>
+          </w:p>
+        </w:tc>
+        <w:tc>
+          <w:tcPr>
+            <w:tcW w:w="1152" w:type="dxa"/>
+            <w:tcBorders>
+              <w:top w:val="single" w:sz="6" w:space="0" w:color="000000"/>
+              <w:left w:val="single" w:sz="6" w:space="0" w:color="000000"/>
+              <w:bottom w:val="single" w:sz="6" w:space="0" w:color="000000"/>
+              <w:right w:val="single" w:sz="6" w:space="0" w:color="000000"/>
+            </w:tcBorders>
+          </w:tcPr>
+          <w:p>
+            <w:pPr>
+              <w:pStyle w:val="Tabletext"/>
+            </w:pPr>
+            <w:r>
+              <w:t>0.3</w:t>
+            </w:r>
+          </w:p>
+        </w:tc>
+        <w:tc>
+          <w:tcPr>
+            <w:tcW w:w="3745" w:type="dxa"/>
+            <w:tcBorders>
+              <w:top w:val="single" w:sz="6" w:space="0" w:color="000000"/>
+              <w:left w:val="single" w:sz="6" w:space="0" w:color="000000"/>
+              <w:bottom w:val="single" w:sz="6" w:space="0" w:color="000000"/>
+              <w:right w:val="single" w:sz="6" w:space="0" w:color="000000"/>
+            </w:tcBorders>
+          </w:tcPr>
+          <w:p>
+            <w:pPr>
+              <w:pStyle w:val="Tabletext"/>
+            </w:pPr>
+            <w:r>
+              <w:t>Added sections 3 and 5</w:t>
+            </w:r>
+          </w:p>
+        </w:tc>
+        <w:tc>
+          <w:tcPr>
+            <w:tcW w:w="2303" w:type="dxa"/>
+            <w:tcBorders>
+              <w:top w:val="single" w:sz="6" w:space="0" w:color="000000"/>
+              <w:left w:val="single" w:sz="6" w:space="0" w:color="000000"/>
+              <w:bottom w:val="single" w:sz="6" w:space="0" w:color="000000"/>
+              <w:right w:val="single" w:sz="6" w:space="0" w:color="000000"/>
+            </w:tcBorders>
+          </w:tcPr>
+          <w:p>
+            <w:pPr>
+              <w:pStyle w:val="Tabletext"/>
+            </w:pPr>
+            <w:r>
+              <w:t>Alexander W.</w:t>
             </w:r>
           </w:p>
         </w:tc>
@@ -469,72 +590,6 @@
           </w:p>
         </w:tc>
       </w:tr>
-      <w:tr>
-        <w:tc>
-          <w:tcPr>
-            <w:tcW w:w="2303" w:type="dxa"/>
-            <w:tcBorders>
-              <w:top w:val="single" w:sz="6" w:space="0" w:color="000000"/>
-              <w:left w:val="single" w:sz="6" w:space="0" w:color="000000"/>
-              <w:bottom w:val="single" w:sz="6" w:space="0" w:color="000000"/>
-              <w:right w:val="single" w:sz="6" w:space="0" w:color="000000"/>
-            </w:tcBorders>
-          </w:tcPr>
-          <w:p>
-            <w:pPr>
-              <w:pStyle w:val="Tabletext"/>
-            </w:pPr>
-          </w:p>
-        </w:tc>
-        <w:tc>
-          <w:tcPr>
-            <w:tcW w:w="1152" w:type="dxa"/>
-            <w:tcBorders>
-              <w:top w:val="single" w:sz="6" w:space="0" w:color="000000"/>
-              <w:left w:val="single" w:sz="6" w:space="0" w:color="000000"/>
-              <w:bottom w:val="single" w:sz="6" w:space="0" w:color="000000"/>
-              <w:right w:val="single" w:sz="6" w:space="0" w:color="000000"/>
-            </w:tcBorders>
-          </w:tcPr>
-          <w:p>
-            <w:pPr>
-              <w:pStyle w:val="Tabletext"/>
-            </w:pPr>
-          </w:p>
-        </w:tc>
-        <w:tc>
-          <w:tcPr>
-            <w:tcW w:w="3745" w:type="dxa"/>
-            <w:tcBorders>
-              <w:top w:val="single" w:sz="6" w:space="0" w:color="000000"/>
-              <w:left w:val="single" w:sz="6" w:space="0" w:color="000000"/>
-              <w:bottom w:val="single" w:sz="6" w:space="0" w:color="000000"/>
-              <w:right w:val="single" w:sz="6" w:space="0" w:color="000000"/>
-            </w:tcBorders>
-          </w:tcPr>
-          <w:p>
-            <w:pPr>
-              <w:pStyle w:val="Tabletext"/>
-            </w:pPr>
-          </w:p>
-        </w:tc>
-        <w:tc>
-          <w:tcPr>
-            <w:tcW w:w="2303" w:type="dxa"/>
-            <w:tcBorders>
-              <w:top w:val="single" w:sz="6" w:space="0" w:color="000000"/>
-              <w:left w:val="single" w:sz="6" w:space="0" w:color="000000"/>
-              <w:bottom w:val="single" w:sz="6" w:space="0" w:color="000000"/>
-              <w:right w:val="single" w:sz="6" w:space="0" w:color="000000"/>
-            </w:tcBorders>
-          </w:tcPr>
-          <w:p>
-            <w:pPr>
-              <w:pStyle w:val="Tabletext"/>
-            </w:pPr>
-          </w:p>
-        </w:tc>
-      </w:tr>
     </w:tbl>
     <w:p>
       <w:r>
@@ -1106,7 +1161,15 @@
         <w:pStyle w:val="InfoBlue"/>
       </w:pPr>
       <w:r>
-        <w:t>[This document provides a comprehensive architectural overview of the system, using a number of different architectural views to depict different aspects of the system. It is intended to capture and convey the significant architectural decisions which have been made on the system.]</w:t>
+        <w:t xml:space="preserve">[This document provides a comprehensive architectural overview of the system, using </w:t>
+      </w:r>
+      <w:proofErr w:type="gramStart"/>
+      <w:r>
+        <w:t>a number of</w:t>
+      </w:r>
+      <w:proofErr w:type="gramEnd"/>
+      <w:r>
+        <w:t xml:space="preserve"> different architectural views to depict different aspects of the system. It is intended to capture and convey the significant architectural decisions which have been made on the system.]</w:t>
       </w:r>
     </w:p>
     <w:p>
@@ -1364,30 +1427,78 @@
       <w:r>
         <w:lastRenderedPageBreak/>
         <w:tab/>
-        <w:t xml:space="preserve">an integer that represents the number of inputs the token requires, and a basic toString method that returns </w:t>
-      </w:r>
-      <w:r>
-        <w:tab/>
-        <w:t>the typeOf result of the class. Subclasses of Token are as follows:</w:t>
+        <w:t xml:space="preserve">an integer that represents the number of inputs the token requires, and a basic </w:t>
+      </w:r>
+      <w:proofErr w:type="spellStart"/>
+      <w:r>
+        <w:t>toString</w:t>
+      </w:r>
+      <w:proofErr w:type="spellEnd"/>
+      <w:r>
+        <w:t xml:space="preserve"> method that returns </w:t>
+      </w:r>
+      <w:r>
+        <w:tab/>
+        <w:t xml:space="preserve">the </w:t>
+      </w:r>
+      <w:proofErr w:type="spellStart"/>
+      <w:r>
+        <w:t>typeOf</w:t>
+      </w:r>
+      <w:proofErr w:type="spellEnd"/>
+      <w:r>
+        <w:t xml:space="preserve"> result of the class. Subclasses of Token are as follows:</w:t>
       </w:r>
     </w:p>
     <w:p/>
     <w:p>
       <w:r>
         <w:tab/>
-        <w:t>-Integer – 0 inputs, contains an integer, overrides toString to return the stored value</w:t>
-      </w:r>
-    </w:p>
-    <w:p>
-      <w:r>
-        <w:tab/>
-        <w:t>-Float – 0 inputs, contains a float, overrides toString to return the stored value</w:t>
-      </w:r>
-    </w:p>
-    <w:p>
-      <w:r>
-        <w:tab/>
-        <w:t xml:space="preserve">-Parentheses – 0 inputs, contains an array of Tokens, overrides toString to return the toStrings of the array </w:t>
+        <w:t xml:space="preserve">-Integer – 0 inputs, contains an integer, overrides </w:t>
+      </w:r>
+      <w:proofErr w:type="spellStart"/>
+      <w:r>
+        <w:t>toString</w:t>
+      </w:r>
+      <w:proofErr w:type="spellEnd"/>
+      <w:r>
+        <w:t xml:space="preserve"> to return the stored value</w:t>
+      </w:r>
+    </w:p>
+    <w:p>
+      <w:r>
+        <w:tab/>
+        <w:t xml:space="preserve">-Float – 0 inputs, contains a float, overrides </w:t>
+      </w:r>
+      <w:proofErr w:type="spellStart"/>
+      <w:r>
+        <w:t>toString</w:t>
+      </w:r>
+      <w:proofErr w:type="spellEnd"/>
+      <w:r>
+        <w:t xml:space="preserve"> to return the stored value</w:t>
+      </w:r>
+    </w:p>
+    <w:p>
+      <w:r>
+        <w:tab/>
+        <w:t xml:space="preserve">-Parentheses – 0 inputs, contains an array of Tokens, overrides </w:t>
+      </w:r>
+      <w:proofErr w:type="spellStart"/>
+      <w:r>
+        <w:t>toString</w:t>
+      </w:r>
+      <w:proofErr w:type="spellEnd"/>
+      <w:r>
+        <w:t xml:space="preserve"> to return the </w:t>
+      </w:r>
+      <w:proofErr w:type="spellStart"/>
+      <w:r>
+        <w:t>toStrings</w:t>
+      </w:r>
+      <w:proofErr w:type="spellEnd"/>
+      <w:r>
+        <w:t xml:space="preserve"> of the array </w:t>
       </w:r>
       <w:r>
         <w:tab/>
@@ -1405,7 +1516,14 @@
       </w:r>
       <w:r>
         <w:tab/>
-        <w:t>toString to return the string representation of the operation represented</w:t>
+      </w:r>
+      <w:proofErr w:type="spellStart"/>
+      <w:r>
+        <w:t>toString</w:t>
+      </w:r>
+      <w:proofErr w:type="spellEnd"/>
+      <w:r>
+        <w:t xml:space="preserve"> to return the string representation of the operation represented</w:t>
       </w:r>
     </w:p>
     <w:p>
@@ -1435,13 +1553,29 @@
     <w:p>
       <w:r>
         <w:tab/>
-        <w:t>-Checks the ordering of Tokens to make sure each has the correct number of inputs to consume.</w:t>
-      </w:r>
-    </w:p>
-    <w:p>
-      <w:r>
-        <w:tab/>
-        <w:t>-Re-orders the Tokens in the given array to follow PEMDAS evaluation order.</w:t>
+        <w:t>-</w:t>
+      </w:r>
+      <w:proofErr w:type="gramStart"/>
+      <w:r>
+        <w:t>Checks</w:t>
+      </w:r>
+      <w:proofErr w:type="gramEnd"/>
+      <w:r>
+        <w:t xml:space="preserve"> the ordering of Tokens to make sure each has the correct number of inputs to consume.</w:t>
+      </w:r>
+    </w:p>
+    <w:p>
+      <w:r>
+        <w:tab/>
+        <w:t>-Re-</w:t>
+      </w:r>
+      <w:proofErr w:type="gramStart"/>
+      <w:r>
+        <w:t>orders</w:t>
+      </w:r>
+      <w:proofErr w:type="gramEnd"/>
+      <w:r>
+        <w:t xml:space="preserve"> the Tokens in the given array to follow PEMDAS evaluation order.</w:t>
       </w:r>
     </w:p>
     <w:p>
@@ -1453,7 +1587,15 @@
     <w:p>
       <w:r>
         <w:tab/>
-        <w:t>-Returns error state as a boolean.</w:t>
+        <w:t xml:space="preserve">-Returns error state as a </w:t>
+      </w:r>
+      <w:proofErr w:type="spellStart"/>
+      <w:r>
+        <w:t>boolean</w:t>
+      </w:r>
+      <w:proofErr w:type="spellEnd"/>
+      <w:r>
+        <w:t>.</w:t>
       </w:r>
     </w:p>
     <w:p>
@@ -1477,7 +1619,15 @@
     <w:p>
       <w:r>
         <w:tab/>
-        <w:t>-Evaluates the Tokens recursively.</w:t>
+        <w:t>-</w:t>
+      </w:r>
+      <w:proofErr w:type="gramStart"/>
+      <w:r>
+        <w:t>Evaluates</w:t>
+      </w:r>
+      <w:proofErr w:type="gramEnd"/>
+      <w:r>
+        <w:t xml:space="preserve"> the Tokens recursively.</w:t>
       </w:r>
     </w:p>
     <w:p>
@@ -1531,11 +1681,34 @@
     </w:p>
     <w:p>
       <w:pPr>
-        <w:pStyle w:val="InfoBlue"/>
-      </w:pPr>
-      <w:r>
-        <w:t>[This section describes the software requirements and objectives that have some significant impact on the architecture; for example, safety, security, privacy, use of an off-the-shelf product, portability, distribution, and reuse. It also captures the special constraints that may apply: design and implementation strategy, development tools, team structure, schedule, legacy code, and so on.]</w:t>
-      </w:r>
+        <w:ind w:left="720"/>
+      </w:pPr>
+      <w:r>
+        <w:t xml:space="preserve">The software will function as an arithmetic expression parser, evaluating inputs in the correct order (PEMDAS) and with proper parentheses grouping, as well being able to detect a variety of syntax and mathematical errors. The program will be implemented entirely in C++ using an </w:t>
+      </w:r>
+      <w:r>
+        <w:t>object-oriented</w:t>
+      </w:r>
+      <w:r>
+        <w:t xml:space="preserve"> design philosophy and taking </w:t>
+      </w:r>
+      <w:r>
+        <w:t>input</w:t>
+      </w:r>
+      <w:r>
+        <w:t xml:space="preserve">/displaying outputs via command line interface. The program's functionality will be based on its ability to pass a series of </w:t>
+      </w:r>
+      <w:r>
+        <w:t>team-developed</w:t>
+      </w:r>
+      <w:r>
+        <w:t xml:space="preserve"> unit tests.</w:t>
+      </w:r>
+    </w:p>
+    <w:p>
+      <w:pPr>
+        <w:ind w:left="720"/>
+      </w:pPr>
     </w:p>
     <w:p>
       <w:pPr>
@@ -1595,7 +1768,35 @@
         <w:rPr>
           <w:highlight w:val="yellow"/>
         </w:rPr>
-        <w:t>[This section illustrates how the software actually works by giving a few selected use-case (or scenario) realizations, and explains how the various design model elements contribute to their functionality. If a Use-Case Realization Document is available, refer to it in this section.]</w:t>
+        <w:t xml:space="preserve">[This section illustrates how the software </w:t>
+      </w:r>
+      <w:proofErr w:type="gramStart"/>
+      <w:r>
+        <w:rPr>
+          <w:highlight w:val="yellow"/>
+        </w:rPr>
+        <w:t>actually works</w:t>
+      </w:r>
+      <w:proofErr w:type="gramEnd"/>
+      <w:r>
+        <w:rPr>
+          <w:highlight w:val="yellow"/>
+        </w:rPr>
+        <w:t xml:space="preserve"> by giving a few selected use-case (or scenario) </w:t>
+      </w:r>
+      <w:proofErr w:type="gramStart"/>
+      <w:r>
+        <w:rPr>
+          <w:highlight w:val="yellow"/>
+        </w:rPr>
+        <w:t>realizations, and</w:t>
+      </w:r>
+      <w:proofErr w:type="gramEnd"/>
+      <w:r>
+        <w:rPr>
+          <w:highlight w:val="yellow"/>
+        </w:rPr>
+        <w:t xml:space="preserve"> explains how the various design model elements contribute to their functionality. If a Use-Case Realization Document is available, refer to it in this section.]</w:t>
       </w:r>
     </w:p>
     <w:p/>
@@ -1617,7 +1818,15 @@
         <w:pStyle w:val="InfoBlue"/>
       </w:pPr>
       <w:r>
-        <w:t>[This section describes the architecturally significant parts of the design model, such as its decomposition into subsystems and packages. And for each significant package, its decomposition into classes and class utilities. You should introduce architecturally significant classes and describe their responsibilities, as well as a few very important relationships, operations, and attributes.]</w:t>
+        <w:t xml:space="preserve">[This section describes the architecturally significant parts of the design model, such as its decomposition into subsystems and packages. And for each significant package, </w:t>
+      </w:r>
+      <w:proofErr w:type="gramStart"/>
+      <w:r>
+        <w:t>its</w:t>
+      </w:r>
+      <w:proofErr w:type="gramEnd"/>
+      <w:r>
+        <w:t xml:space="preserve"> decomposition into classes and class utilities. You should introduce architecturally significant classes and describe their responsibilities, as well as a few very important relationships, operations, and attributes.]</w:t>
       </w:r>
     </w:p>
     <w:p>
@@ -1627,20 +1836,29 @@
       </w:pPr>
       <w:bookmarkStart w:id="17" w:name="_Toc6187938"/>
       <w:r>
+        <w:lastRenderedPageBreak/>
         <w:t>Overview</w:t>
       </w:r>
       <w:bookmarkEnd w:id="17"/>
     </w:p>
     <w:p>
       <w:pPr>
-        <w:pStyle w:val="InfoBlue"/>
-      </w:pPr>
-      <w:r>
-        <w:t xml:space="preserve">[This subsection describes the overall decomposition of the design model in terms of its package hierarchy </w:t>
-      </w:r>
-      <w:r>
-        <w:lastRenderedPageBreak/>
-        <w:t>and layers.]</w:t>
+        <w:ind w:left="720"/>
+      </w:pPr>
+      <w:r>
+        <w:t xml:space="preserve">Structured using </w:t>
+      </w:r>
+      <w:r>
+        <w:t>object-oriented</w:t>
+      </w:r>
+      <w:r>
+        <w:t xml:space="preserve"> programming principles to separate the program into independent sections. The program decomposes into 5 main packages, reading user input and returning program output, tokenizing user input, parsing tokens generated from user input, evaluating parsed </w:t>
+      </w:r>
+      <w:r>
+        <w:t>expressions,</w:t>
+      </w:r>
+      <w:r>
+        <w:t xml:space="preserve"> and error handling.</w:t>
       </w:r>
     </w:p>
     <w:p>
@@ -1656,18 +1874,367 @@
     </w:p>
     <w:p>
       <w:pPr>
-        <w:pStyle w:val="InfoBlue"/>
-      </w:pPr>
-      <w:r>
-        <w:t xml:space="preserve">[For each significant package, include a subsection with its name, its brief description, and a diagram with all significant classes and packages contained within the package. </w:t>
-      </w:r>
-    </w:p>
-    <w:p>
-      <w:pPr>
-        <w:pStyle w:val="InfoBlue"/>
-      </w:pPr>
-      <w:r>
-        <w:t>For each significant class in the package, include its name, brief description, and, optionally, a description of some of its major responsibilities, operations, and attributes.]</w:t>
+        <w:ind w:left="720"/>
+      </w:pPr>
+      <w:r>
+        <w:t>User Interface</w:t>
+      </w:r>
+    </w:p>
+    <w:p>
+      <w:pPr>
+        <w:ind w:left="720"/>
+      </w:pPr>
+      <w:r>
+        <w:tab/>
+        <w:t>Provides a command line interface for the user, prompts user to enter an arithmetic expression and returns the result.</w:t>
+      </w:r>
+    </w:p>
+    <w:p>
+      <w:pPr>
+        <w:ind w:left="720"/>
+      </w:pPr>
+    </w:p>
+    <w:p>
+      <w:pPr>
+        <w:ind w:left="720"/>
+      </w:pPr>
+      <w:r>
+        <w:tab/>
+      </w:r>
+      <w:proofErr w:type="spellStart"/>
+      <w:proofErr w:type="gramStart"/>
+      <w:r>
+        <w:t>displayMenu</w:t>
+      </w:r>
+      <w:proofErr w:type="spellEnd"/>
+      <w:r>
+        <w:t>(</w:t>
+      </w:r>
+      <w:proofErr w:type="gramEnd"/>
+      <w:r>
+        <w:t>) - displays starting menu</w:t>
+      </w:r>
+    </w:p>
+    <w:p>
+      <w:pPr>
+        <w:ind w:left="720"/>
+      </w:pPr>
+      <w:r>
+        <w:tab/>
+      </w:r>
+      <w:proofErr w:type="spellStart"/>
+      <w:proofErr w:type="gramStart"/>
+      <w:r>
+        <w:t>getInput</w:t>
+      </w:r>
+      <w:proofErr w:type="spellEnd"/>
+      <w:r>
+        <w:t>(</w:t>
+      </w:r>
+      <w:proofErr w:type="gramEnd"/>
+      <w:r>
+        <w:t xml:space="preserve">) - asks the user for an expression to evaluate </w:t>
+      </w:r>
+    </w:p>
+    <w:p>
+      <w:pPr>
+        <w:ind w:left="720"/>
+      </w:pPr>
+      <w:r>
+        <w:tab/>
+      </w:r>
+      <w:proofErr w:type="spellStart"/>
+      <w:r>
+        <w:t>dislpayResult</w:t>
+      </w:r>
+      <w:proofErr w:type="spellEnd"/>
+      <w:r>
+        <w:t xml:space="preserve"> (float result) - displays result after evaluation stage</w:t>
+      </w:r>
+    </w:p>
+    <w:p>
+      <w:pPr>
+        <w:ind w:left="720"/>
+      </w:pPr>
+    </w:p>
+    <w:p>
+      <w:pPr>
+        <w:ind w:left="720"/>
+      </w:pPr>
+      <w:r>
+        <w:t>Tokenizer</w:t>
+      </w:r>
+    </w:p>
+    <w:p>
+      <w:pPr>
+        <w:ind w:left="1440"/>
+      </w:pPr>
+      <w:r>
+        <w:t xml:space="preserve">Converts input into </w:t>
+      </w:r>
+      <w:r>
+        <w:t>recognizable</w:t>
+      </w:r>
+      <w:r>
+        <w:t xml:space="preserve"> tokens. Sorts characters into numeric constants, operators, and parentheses</w:t>
+      </w:r>
+    </w:p>
+    <w:p>
+      <w:pPr>
+        <w:ind w:left="720"/>
+      </w:pPr>
+    </w:p>
+    <w:p>
+      <w:pPr>
+        <w:ind w:left="720"/>
+      </w:pPr>
+      <w:r>
+        <w:tab/>
+      </w:r>
+      <w:proofErr w:type="gramStart"/>
+      <w:r>
+        <w:t>Token(</w:t>
+      </w:r>
+      <w:proofErr w:type="gramEnd"/>
+      <w:r>
+        <w:t xml:space="preserve">) - represents a single unit of </w:t>
+      </w:r>
+      <w:r>
+        <w:t>expression</w:t>
+      </w:r>
+      <w:r>
+        <w:t>, numeric constant, operator, or parenthesis</w:t>
+      </w:r>
+    </w:p>
+    <w:p>
+      <w:pPr>
+        <w:ind w:left="720"/>
+      </w:pPr>
+      <w:r>
+        <w:tab/>
+      </w:r>
+      <w:proofErr w:type="gramStart"/>
+      <w:r>
+        <w:t>Lexer(</w:t>
+      </w:r>
+      <w:proofErr w:type="gramEnd"/>
+      <w:r>
+        <w:t>) - scans input string to return a list of tokens present in that string</w:t>
+      </w:r>
+    </w:p>
+    <w:p>
+      <w:pPr>
+        <w:ind w:left="720"/>
+      </w:pPr>
+    </w:p>
+    <w:p>
+      <w:pPr>
+        <w:ind w:left="720"/>
+      </w:pPr>
+      <w:r>
+        <w:t>Parser</w:t>
+      </w:r>
+    </w:p>
+    <w:p>
+      <w:pPr>
+        <w:ind w:left="1440"/>
+      </w:pPr>
+      <w:r>
+        <w:t xml:space="preserve">Creates a data </w:t>
+      </w:r>
+      <w:r>
+        <w:t>structure</w:t>
+      </w:r>
+      <w:r>
+        <w:t xml:space="preserve"> (stack or tree) to represent the structure of the tokenized expression. Uses this structure to decide on execution order and grouping.</w:t>
+      </w:r>
+    </w:p>
+    <w:p>
+      <w:pPr>
+        <w:ind w:left="720"/>
+      </w:pPr>
+    </w:p>
+    <w:p>
+      <w:pPr>
+        <w:ind w:left="1440"/>
+      </w:pPr>
+      <w:proofErr w:type="gramStart"/>
+      <w:r>
+        <w:t>Parser(</w:t>
+      </w:r>
+      <w:proofErr w:type="gramEnd"/>
+      <w:r>
+        <w:t>) - converts list tokens into chosen data structure (stack or tree) organized by operator precedence</w:t>
+      </w:r>
+    </w:p>
+    <w:p>
+      <w:pPr>
+        <w:ind w:left="720"/>
+      </w:pPr>
+      <w:r>
+        <w:tab/>
+      </w:r>
+    </w:p>
+    <w:p>
+      <w:pPr>
+        <w:ind w:left="720"/>
+      </w:pPr>
+      <w:r>
+        <w:t>Evaluation</w:t>
+      </w:r>
+    </w:p>
+    <w:p>
+      <w:pPr>
+        <w:ind w:left="720"/>
+      </w:pPr>
+      <w:r>
+        <w:tab/>
+      </w:r>
+      <w:proofErr w:type="gramStart"/>
+      <w:r>
+        <w:t>Computes</w:t>
+      </w:r>
+      <w:proofErr w:type="gramEnd"/>
+      <w:r>
+        <w:t xml:space="preserve"> the expression from the parsed data structure. </w:t>
+      </w:r>
+    </w:p>
+    <w:p>
+      <w:pPr>
+        <w:ind w:left="720"/>
+      </w:pPr>
+    </w:p>
+    <w:p>
+      <w:pPr>
+        <w:ind w:left="720"/>
+      </w:pPr>
+      <w:r>
+        <w:tab/>
+        <w:t>Evaluator(</w:t>
+      </w:r>
+      <w:proofErr w:type="spellStart"/>
+      <w:r>
+        <w:t>parserDS</w:t>
+      </w:r>
+      <w:proofErr w:type="spellEnd"/>
+      <w:r>
+        <w:t xml:space="preserve">) - </w:t>
+      </w:r>
+      <w:r>
+        <w:t>evaluates</w:t>
+      </w:r>
+      <w:r>
+        <w:t xml:space="preserve"> expressions as it moves through the sorted data structure </w:t>
+      </w:r>
+    </w:p>
+    <w:p>
+      <w:pPr>
+        <w:ind w:left="720"/>
+      </w:pPr>
+    </w:p>
+    <w:p>
+      <w:pPr>
+        <w:ind w:left="720"/>
+      </w:pPr>
+      <w:r>
+        <w:t>Error Handling</w:t>
+      </w:r>
+    </w:p>
+    <w:p>
+      <w:pPr>
+        <w:ind w:left="720"/>
+      </w:pPr>
+      <w:r>
+        <w:tab/>
+        <w:t>Intercepts invalid input and operations to prevent the program from crashing</w:t>
+      </w:r>
+    </w:p>
+    <w:p>
+      <w:pPr>
+        <w:ind w:left="720"/>
+      </w:pPr>
+    </w:p>
+    <w:p>
+      <w:pPr>
+        <w:ind w:left="720"/>
+      </w:pPr>
+      <w:r>
+        <w:tab/>
+      </w:r>
+      <w:proofErr w:type="spellStart"/>
+      <w:proofErr w:type="gramStart"/>
+      <w:r>
+        <w:t>reportError</w:t>
+      </w:r>
+      <w:proofErr w:type="spellEnd"/>
+      <w:r>
+        <w:t>(</w:t>
+      </w:r>
+      <w:proofErr w:type="gramEnd"/>
+      <w:r>
+        <w:t xml:space="preserve">string error) - returns the error found in user input to the command line </w:t>
+      </w:r>
+    </w:p>
+    <w:p>
+      <w:pPr>
+        <w:ind w:left="720"/>
+      </w:pPr>
+    </w:p>
+    <w:p>
+      <w:pPr>
+        <w:ind w:left="720"/>
+      </w:pPr>
+      <w:r>
+        <w:lastRenderedPageBreak/>
+        <w:fldChar w:fldCharType="begin"/>
+      </w:r>
+      <w:r>
+        <w:instrText xml:space="preserve"> INCLUDEPICTURE "C:\\Users\\alexj\\Downloads\\packagediagram.PNG" \* MERGEFORMATINET </w:instrText>
+      </w:r>
+      <w:r>
+        <w:fldChar w:fldCharType="separate"/>
+      </w:r>
+      <w:r>
+        <w:pict w14:anchorId="4878DFF4">
+          <v:shapetype id="_x0000_t75" coordsize="21600,21600" o:spt="75" o:preferrelative="t" path="m@4@5l@4@11@9@11@9@5xe" filled="f" stroked="f">
+            <v:stroke joinstyle="miter"/>
+            <v:formulas>
+              <v:f eqn="if lineDrawn pixelLineWidth 0"/>
+              <v:f eqn="sum @0 1 0"/>
+              <v:f eqn="sum 0 0 @1"/>
+              <v:f eqn="prod @2 1 2"/>
+              <v:f eqn="prod @3 21600 pixelWidth"/>
+              <v:f eqn="prod @3 21600 pixelHeight"/>
+              <v:f eqn="sum @0 0 1"/>
+              <v:f eqn="prod @6 1 2"/>
+              <v:f eqn="prod @7 21600 pixelWidth"/>
+              <v:f eqn="sum @8 21600 0"/>
+              <v:f eqn="prod @7 21600 pixelHeight"/>
+              <v:f eqn="sum @10 21600 0"/>
+            </v:formulas>
+            <v:path o:extrusionok="f" gradientshapeok="t" o:connecttype="rect"/>
+            <o:lock v:ext="edit" aspectratio="t"/>
+          </v:shapetype>
+          <v:shape id="_x0000_i1031" type="#_x0000_t75" alt="" style="width:483.75pt;height:248.25pt">
+            <v:imagedata r:id="rId10" r:href="rId11"/>
+          </v:shape>
+        </w:pict>
+      </w:r>
+      <w:r>
+        <w:fldChar w:fldCharType="end"/>
+      </w:r>
+    </w:p>
+    <w:p>
+      <w:pPr>
+        <w:ind w:left="720"/>
+      </w:pPr>
+    </w:p>
+    <w:p>
+      <w:pPr>
+        <w:ind w:left="720"/>
+      </w:pPr>
+      <w:r>
+        <w:tab/>
       </w:r>
     </w:p>
     <w:p>
@@ -1819,7 +2386,23 @@
           <w:iCs/>
           <w:color w:val="000000"/>
         </w:rPr>
-        <w:t>The system contains proper error handling for cases such as incorrect inputs, division by zero, and other errors that might arise during the tokenization, parsing, and evaluation processes.</w:t>
+        <w:t xml:space="preserve">The system contains proper </w:t>
+      </w:r>
+      <w:proofErr w:type="gramStart"/>
+      <w:r>
+        <w:rPr>
+          <w:iCs/>
+          <w:color w:val="000000"/>
+        </w:rPr>
+        <w:t>error handling</w:t>
+      </w:r>
+      <w:proofErr w:type="gramEnd"/>
+      <w:r>
+        <w:rPr>
+          <w:iCs/>
+          <w:color w:val="000000"/>
+        </w:rPr>
+        <w:t xml:space="preserve"> for cases such as incorrect inputs, division by zero, and other errors that might arise during the tokenization, parsing, and evaluation processes.</w:t>
       </w:r>
     </w:p>
     <w:p>
@@ -1855,35 +2438,7 @@
           <w:iCs/>
           <w:color w:val="000000"/>
         </w:rPr>
-        <w:t>The system follows the principles of object-oriented programming with clearly</w:t>
-      </w:r>
-      <w:r>
-        <w:rPr>
-          <w:iCs/>
-          <w:color w:val="000000"/>
-        </w:rPr>
-        <w:t xml:space="preserve"> </w:t>
-      </w:r>
-      <w:r>
-        <w:rPr>
-          <w:iCs/>
-          <w:color w:val="000000"/>
-        </w:rPr>
-        <w:t>defined classes such as Token and its subclasses</w:t>
-      </w:r>
-      <w:r>
-        <w:rPr>
-          <w:iCs/>
-          <w:color w:val="000000"/>
-        </w:rPr>
-        <w:t>,</w:t>
-      </w:r>
-      <w:r>
-        <w:rPr>
-          <w:iCs/>
-          <w:color w:val="000000"/>
-        </w:rPr>
-        <w:t xml:space="preserve"> which make the architecture more readable and convenient for debugging, modifying, and updating in the future.</w:t>
+        <w:t>The system follows the principles of object-oriented programming with clearly defined classes such as Token and its subclasses, which make the architecture more readable and convenient for debugging, modifying, and updating in the future.</w:t>
       </w:r>
     </w:p>
     <w:p>
@@ -1939,6 +2494,7 @@
           <w:iCs/>
           <w:color w:val="000000"/>
         </w:rPr>
+        <w:lastRenderedPageBreak/>
         <w:t>Performance:</w:t>
       </w:r>
     </w:p>
@@ -1990,28 +2546,14 @@
           <w:iCs/>
           <w:color w:val="000000"/>
         </w:rPr>
-        <w:t xml:space="preserve">The system was developed using standard C++, which means that it can run on any platform with </w:t>
-      </w:r>
-      <w:r>
-        <w:rPr>
-          <w:iCs/>
-          <w:color w:val="000000"/>
-        </w:rPr>
-        <w:t xml:space="preserve">a </w:t>
-      </w:r>
-      <w:r>
-        <w:rPr>
-          <w:iCs/>
-          <w:color w:val="000000"/>
-        </w:rPr>
-        <w:t>proper compiler installed.</w:t>
+        <w:t>The system was developed using standard C++, which means that it can run on any platform with a proper compiler installed.</w:t>
       </w:r>
     </w:p>
     <w:sectPr>
-      <w:headerReference w:type="default" r:id="rId10"/>
-      <w:footerReference w:type="default" r:id="rId11"/>
-      <w:headerReference w:type="first" r:id="rId12"/>
-      <w:footerReference w:type="first" r:id="rId13"/>
+      <w:headerReference w:type="default" r:id="rId12"/>
+      <w:footerReference w:type="default" r:id="rId13"/>
+      <w:headerReference w:type="first" r:id="rId14"/>
+      <w:footerReference w:type="first" r:id="rId15"/>
       <w:pgSz w:w="12240" w:h="15840"/>
       <w:pgMar w:top="1440" w:right="1440" w:bottom="1440" w:left="1440" w:header="720" w:footer="720" w:gutter="0"/>
       <w:cols w:space="720"/>
@@ -2063,7 +2605,7 @@
           <v:stroke joinstyle="miter"/>
           <v:path gradientshapeok="t" o:connecttype="rect"/>
         </v:shapetype>
-        <v:shape id="Text Box 2" o:spid="_x0000_s1025" type="#_x0000_t202" style="position:absolute;margin-left:-50.05pt;margin-top:.05pt;width:1.15pt;height:1.15pt;z-index:1;visibility:visible;mso-wrap-style:square;mso-width-percent:0;mso-height-percent:0;mso-wrap-distance-left:0;mso-wrap-distance-top:0;mso-wrap-distance-right:0;mso-wrap-distance-bottom:0;mso-position-horizontal:right;mso-position-horizontal-relative:margin;mso-position-vertical:absolute;mso-position-vertical-relative:text;mso-width-percent:0;mso-height-percent:0;mso-width-relative:page;mso-height-relative:page;v-text-anchor:top" o:gfxdata="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" stroked="f">
+        <v:shape id="Text Box 2" o:spid="_x0000_s1025" type="#_x0000_t202" style="position:absolute;margin-left:-100.1pt;margin-top:.05pt;width:1.15pt;height:1.15pt;z-index:1;visibility:visible;mso-wrap-style:square;mso-width-percent:0;mso-height-percent:0;mso-wrap-distance-left:0;mso-wrap-distance-top:0;mso-wrap-distance-right:0;mso-wrap-distance-bottom:0;mso-position-horizontal:right;mso-position-horizontal-relative:margin;mso-position-vertical:absolute;mso-position-vertical-relative:text;mso-width-percent:0;mso-height-percent:0;mso-width-relative:page;mso-height-relative:page;v-text-anchor:top" o:gfxdata="" stroked="f">
           <v:fill opacity="0"/>
           <v:textbox style="mso-fit-shape-to-text:t" inset="0,0,0,0">
             <w:txbxContent>
@@ -2576,19 +3118,7 @@
         </w:tcPr>
         <w:p>
           <w:r>
-            <w:t>EECS348-S</w:t>
-          </w:r>
-          <w:r>
-            <w:t>AD</w:t>
-          </w:r>
-          <w:r>
-            <w:t>-TermProj-</w:t>
-          </w:r>
-          <w:r>
-            <w:t>v</w:t>
-          </w:r>
-          <w:r>
-            <w:t>1.</w:t>
+            <w:t>EECS348-SAD-TermProj-v1.</w:t>
           </w:r>
           <w:r>
             <w:t>0</w:t>
@@ -3300,7 +3830,6 @@
   <w:style w:type="character" w:default="1" w:styleId="DefaultParagraphFont">
     <w:name w:val="Default Paragraph Font"/>
     <w:uiPriority w:val="1"/>
-    <w:semiHidden/>
     <w:unhideWhenUsed/>
   </w:style>
   <w:style w:type="table" w:default="1" w:styleId="TableNormal">

</xml_diff>

<commit_message>
version number realignment: title and header edition
</commit_message>
<xml_diff>
--- a/documentation/editables/03-Software-Architecture-Design.docx
+++ b/documentation/editables/03-Software-Architecture-Design.docx
@@ -62,7 +62,13 @@
         <w:rPr>
           <w:sz w:val="28"/>
         </w:rPr>
-        <w:t>Version 1.7</w:t>
+        <w:t>Version 1.</w:t>
+      </w:r>
+      <w:r>
+        <w:rPr>
+          <w:sz w:val="28"/>
+        </w:rPr>
+        <w:t>0</w:t>
       </w:r>
     </w:p>
     <w:p>
@@ -77,19 +83,8 @@
     <w:p>
       <w:pPr>
         <w:pStyle w:val="InfoBlue"/>
-        <w:rPr/>
-      </w:pPr>
-      <w:r>
-        <w:rPr/>
-      </w:r>
-    </w:p>
-    <w:p>
-      <w:pPr>
-        <w:pStyle w:val="Title"/>
         <w:spacing w:before="0" w:after="0"/>
-        <w:rPr>
-          <w:sz w:val="28"/>
-        </w:rPr>
+        <w:rPr/>
         <w:sectPr>
           <w:headerReference w:type="even" r:id="rId2"/>
           <w:headerReference w:type="default" r:id="rId3"/>
@@ -108,9 +103,7 @@
         </w:sectPr>
       </w:pPr>
       <w:r>
-        <w:rPr>
-          <w:sz w:val="28"/>
-        </w:rPr>
+        <w:rPr/>
       </w:r>
     </w:p>
     <w:p>
@@ -138,16 +131,16 @@
         <w:tblLook w:firstRow="0" w:noVBand="0" w:lastRow="0" w:firstColumn="0" w:lastColumn="0" w:noHBand="0" w:val="0000"/>
       </w:tblPr>
       <w:tblGrid>
-        <w:gridCol w:w="2303"/>
+        <w:gridCol w:w="2302"/>
         <w:gridCol w:w="1152"/>
-        <w:gridCol w:w="3745"/>
+        <w:gridCol w:w="3746"/>
         <w:gridCol w:w="2304"/>
       </w:tblGrid>
       <w:tr>
         <w:trPr/>
         <w:tc>
           <w:tcPr>
-            <w:tcW w:w="2303" w:type="dxa"/>
+            <w:tcW w:w="2302" w:type="dxa"/>
             <w:tcBorders>
               <w:top w:val="single" w:sz="6" w:space="0" w:color="000000"/>
               <w:left w:val="single" w:sz="6" w:space="0" w:color="000000"/>
@@ -201,7 +194,7 @@
         </w:tc>
         <w:tc>
           <w:tcPr>
-            <w:tcW w:w="3745" w:type="dxa"/>
+            <w:tcW w:w="3746" w:type="dxa"/>
             <w:tcBorders>
               <w:top w:val="single" w:sz="6" w:space="0" w:color="000000"/>
               <w:left w:val="single" w:sz="6" w:space="0" w:color="000000"/>
@@ -258,7 +251,7 @@
         <w:trPr/>
         <w:tc>
           <w:tcPr>
-            <w:tcW w:w="2303" w:type="dxa"/>
+            <w:tcW w:w="2302" w:type="dxa"/>
             <w:tcBorders>
               <w:top w:val="single" w:sz="6" w:space="0" w:color="000000"/>
               <w:left w:val="single" w:sz="6" w:space="0" w:color="000000"/>
@@ -298,17 +291,13 @@
             </w:pPr>
             <w:r>
               <w:rPr/>
-              <w:t>0</w:t>
-            </w:r>
-            <w:r>
-              <w:rPr/>
-              <w:t>.1</w:t>
+              <w:t>0.1</w:t>
             </w:r>
           </w:p>
         </w:tc>
         <w:tc>
           <w:tcPr>
-            <w:tcW w:w="3745" w:type="dxa"/>
+            <w:tcW w:w="3746" w:type="dxa"/>
             <w:tcBorders>
               <w:top w:val="single" w:sz="6" w:space="0" w:color="000000"/>
               <w:left w:val="single" w:sz="6" w:space="0" w:color="000000"/>
@@ -357,7 +346,7 @@
         <w:trPr/>
         <w:tc>
           <w:tcPr>
-            <w:tcW w:w="2303" w:type="dxa"/>
+            <w:tcW w:w="2302" w:type="dxa"/>
             <w:tcBorders>
               <w:top w:val="single" w:sz="6" w:space="0" w:color="000000"/>
               <w:left w:val="single" w:sz="6" w:space="0" w:color="000000"/>
@@ -397,17 +386,13 @@
             </w:pPr>
             <w:r>
               <w:rPr/>
-              <w:t>0</w:t>
-            </w:r>
-            <w:r>
-              <w:rPr/>
-              <w:t>.2</w:t>
+              <w:t>0.2</w:t>
             </w:r>
           </w:p>
         </w:tc>
         <w:tc>
           <w:tcPr>
-            <w:tcW w:w="3745" w:type="dxa"/>
+            <w:tcW w:w="3746" w:type="dxa"/>
             <w:tcBorders>
               <w:top w:val="single" w:sz="6" w:space="0" w:color="000000"/>
               <w:left w:val="single" w:sz="6" w:space="0" w:color="000000"/>
@@ -456,7 +441,7 @@
         <w:trPr/>
         <w:tc>
           <w:tcPr>
-            <w:tcW w:w="2303" w:type="dxa"/>
+            <w:tcW w:w="2302" w:type="dxa"/>
             <w:tcBorders>
               <w:top w:val="single" w:sz="6" w:space="0" w:color="000000"/>
               <w:left w:val="single" w:sz="6" w:space="0" w:color="000000"/>
@@ -496,17 +481,13 @@
             </w:pPr>
             <w:r>
               <w:rPr/>
-              <w:t>0</w:t>
-            </w:r>
-            <w:r>
-              <w:rPr/>
-              <w:t>.3</w:t>
+              <w:t>0.3</w:t>
             </w:r>
           </w:p>
         </w:tc>
         <w:tc>
           <w:tcPr>
-            <w:tcW w:w="3745" w:type="dxa"/>
+            <w:tcW w:w="3746" w:type="dxa"/>
             <w:tcBorders>
               <w:top w:val="single" w:sz="6" w:space="0" w:color="000000"/>
               <w:left w:val="single" w:sz="6" w:space="0" w:color="000000"/>
@@ -555,7 +536,7 @@
         <w:trPr/>
         <w:tc>
           <w:tcPr>
-            <w:tcW w:w="2303" w:type="dxa"/>
+            <w:tcW w:w="2302" w:type="dxa"/>
             <w:tcBorders>
               <w:top w:val="single" w:sz="6" w:space="0" w:color="000000"/>
               <w:left w:val="single" w:sz="6" w:space="0" w:color="000000"/>
@@ -595,17 +576,13 @@
             </w:pPr>
             <w:r>
               <w:rPr/>
-              <w:t>0</w:t>
-            </w:r>
-            <w:r>
-              <w:rPr/>
-              <w:t>.4</w:t>
+              <w:t>0.4</w:t>
             </w:r>
           </w:p>
         </w:tc>
         <w:tc>
           <w:tcPr>
-            <w:tcW w:w="3745" w:type="dxa"/>
+            <w:tcW w:w="3746" w:type="dxa"/>
             <w:tcBorders>
               <w:top w:val="single" w:sz="6" w:space="0" w:color="000000"/>
               <w:left w:val="single" w:sz="6" w:space="0" w:color="000000"/>
@@ -654,7 +631,7 @@
         <w:trPr/>
         <w:tc>
           <w:tcPr>
-            <w:tcW w:w="2303" w:type="dxa"/>
+            <w:tcW w:w="2302" w:type="dxa"/>
             <w:tcBorders>
               <w:top w:val="single" w:sz="6" w:space="0" w:color="000000"/>
               <w:left w:val="single" w:sz="6" w:space="0" w:color="000000"/>
@@ -694,17 +671,13 @@
             </w:pPr>
             <w:r>
               <w:rPr/>
-              <w:t>0</w:t>
-            </w:r>
-            <w:r>
-              <w:rPr/>
-              <w:t>.5</w:t>
+              <w:t>0.5</w:t>
             </w:r>
           </w:p>
         </w:tc>
         <w:tc>
           <w:tcPr>
-            <w:tcW w:w="3745" w:type="dxa"/>
+            <w:tcW w:w="3746" w:type="dxa"/>
             <w:tcBorders>
               <w:top w:val="single" w:sz="6" w:space="0" w:color="000000"/>
               <w:left w:val="single" w:sz="6" w:space="0" w:color="000000"/>
@@ -753,7 +726,7 @@
         <w:trPr/>
         <w:tc>
           <w:tcPr>
-            <w:tcW w:w="2303" w:type="dxa"/>
+            <w:tcW w:w="2302" w:type="dxa"/>
             <w:tcBorders>
               <w:top w:val="single" w:sz="6" w:space="0" w:color="000000"/>
               <w:left w:val="single" w:sz="6" w:space="0" w:color="000000"/>
@@ -793,17 +766,13 @@
             </w:pPr>
             <w:r>
               <w:rPr/>
-              <w:t>0</w:t>
-            </w:r>
-            <w:r>
-              <w:rPr/>
-              <w:t>.6</w:t>
+              <w:t>0.6</w:t>
             </w:r>
           </w:p>
         </w:tc>
         <w:tc>
           <w:tcPr>
-            <w:tcW w:w="3745" w:type="dxa"/>
+            <w:tcW w:w="3746" w:type="dxa"/>
             <w:tcBorders>
               <w:top w:val="single" w:sz="6" w:space="0" w:color="000000"/>
               <w:left w:val="single" w:sz="6" w:space="0" w:color="000000"/>
@@ -852,7 +821,7 @@
         <w:trPr/>
         <w:tc>
           <w:tcPr>
-            <w:tcW w:w="2303" w:type="dxa"/>
+            <w:tcW w:w="2302" w:type="dxa"/>
             <w:tcBorders>
               <w:top w:val="single" w:sz="6" w:space="0" w:color="000000"/>
               <w:left w:val="single" w:sz="6" w:space="0" w:color="000000"/>
@@ -892,17 +861,13 @@
             </w:pPr>
             <w:r>
               <w:rPr/>
-              <w:t>1.</w:t>
-            </w:r>
-            <w:r>
-              <w:rPr/>
-              <w:t>0</w:t>
+              <w:t>1.0</w:t>
             </w:r>
           </w:p>
         </w:tc>
         <w:tc>
           <w:tcPr>
-            <w:tcW w:w="3745" w:type="dxa"/>
+            <w:tcW w:w="3746" w:type="dxa"/>
             <w:tcBorders>
               <w:top w:val="single" w:sz="6" w:space="0" w:color="000000"/>
               <w:left w:val="single" w:sz="6" w:space="0" w:color="000000"/>
@@ -1148,6 +1113,7 @@
     <w:p>
       <w:pPr>
         <w:pStyle w:val="Title"/>
+        <w:spacing w:before="0" w:after="0"/>
         <w:rPr/>
       </w:pPr>
       <w:r>
@@ -1171,7 +1137,7 @@
               <w:tab w:val="right" w:pos="9360" w:leader="none"/>
             </w:tabs>
             <w:rPr>
-              <w:rFonts w:ascii="Calibri" w:hAnsi="Calibri" w:eastAsia="" w:cs="Arial" w:asciiTheme="minorHAnsi" w:cstheme="minorBidi" w:eastAsiaTheme="minorEastAsia" w:hAnsiTheme="minorHAnsi"/>
+              <w:rFonts w:ascii="Calibri" w:hAnsi="Calibri" w:eastAsia="" w:cs="" w:asciiTheme="minorHAnsi" w:cstheme="minorBidi" w:eastAsiaTheme="minorEastAsia" w:hAnsiTheme="minorHAnsi"/>
               <w:kern w:val="2"/>
               <w:sz w:val="24"/>
               <w:szCs w:val="24"/>
@@ -1195,7 +1161,7 @@
           </w:r>
           <w:r>
             <w:rPr>
-              <w:rFonts w:eastAsia="" w:cs="Arial" w:ascii="Calibri" w:hAnsi="Calibri" w:asciiTheme="minorHAnsi" w:cstheme="minorBidi" w:eastAsiaTheme="minorEastAsia" w:hAnsiTheme="minorHAnsi"/>
+              <w:rFonts w:eastAsia="" w:cs="" w:ascii="Calibri" w:hAnsi="Calibri" w:asciiTheme="minorHAnsi" w:cstheme="minorBidi" w:eastAsiaTheme="minorEastAsia" w:hAnsiTheme="minorHAnsi"/>
               <w:kern w:val="2"/>
               <w:sz w:val="24"/>
               <w:szCs w:val="24"/>
@@ -1218,7 +1184,7 @@
               <w:tab w:val="right" w:pos="9360" w:leader="none"/>
             </w:tabs>
             <w:rPr>
-              <w:rFonts w:ascii="Calibri" w:hAnsi="Calibri" w:eastAsia="" w:cs="Arial" w:asciiTheme="minorHAnsi" w:cstheme="minorBidi" w:eastAsiaTheme="minorEastAsia" w:hAnsiTheme="minorHAnsi"/>
+              <w:rFonts w:ascii="Calibri" w:hAnsi="Calibri" w:eastAsia="" w:cs="" w:asciiTheme="minorHAnsi" w:cstheme="minorBidi" w:eastAsiaTheme="minorEastAsia" w:hAnsiTheme="minorHAnsi"/>
               <w:kern w:val="2"/>
               <w:sz w:val="24"/>
               <w:szCs w:val="24"/>
@@ -1231,7 +1197,7 @@
           </w:r>
           <w:r>
             <w:rPr>
-              <w:rFonts w:eastAsia="" w:cs="Arial" w:ascii="Calibri" w:hAnsi="Calibri" w:asciiTheme="minorHAnsi" w:cstheme="minorBidi" w:eastAsiaTheme="minorEastAsia" w:hAnsiTheme="minorHAnsi"/>
+              <w:rFonts w:eastAsia="" w:cs="" w:ascii="Calibri" w:hAnsi="Calibri" w:asciiTheme="minorHAnsi" w:cstheme="minorBidi" w:eastAsiaTheme="minorEastAsia" w:hAnsiTheme="minorHAnsi"/>
               <w:kern w:val="2"/>
               <w:sz w:val="24"/>
               <w:szCs w:val="24"/>
@@ -1254,7 +1220,7 @@
               <w:tab w:val="right" w:pos="9360" w:leader="none"/>
             </w:tabs>
             <w:rPr>
-              <w:rFonts w:ascii="Calibri" w:hAnsi="Calibri" w:eastAsia="" w:cs="Arial" w:asciiTheme="minorHAnsi" w:cstheme="minorBidi" w:eastAsiaTheme="minorEastAsia" w:hAnsiTheme="minorHAnsi"/>
+              <w:rFonts w:ascii="Calibri" w:hAnsi="Calibri" w:eastAsia="" w:cs="" w:asciiTheme="minorHAnsi" w:cstheme="minorBidi" w:eastAsiaTheme="minorEastAsia" w:hAnsiTheme="minorHAnsi"/>
               <w:kern w:val="2"/>
               <w:sz w:val="24"/>
               <w:szCs w:val="24"/>
@@ -1267,7 +1233,7 @@
           </w:r>
           <w:r>
             <w:rPr>
-              <w:rFonts w:eastAsia="" w:cs="Arial" w:ascii="Calibri" w:hAnsi="Calibri" w:asciiTheme="minorHAnsi" w:cstheme="minorBidi" w:eastAsiaTheme="minorEastAsia" w:hAnsiTheme="minorHAnsi"/>
+              <w:rFonts w:eastAsia="" w:cs="" w:ascii="Calibri" w:hAnsi="Calibri" w:asciiTheme="minorHAnsi" w:cstheme="minorBidi" w:eastAsiaTheme="minorEastAsia" w:hAnsiTheme="minorHAnsi"/>
               <w:kern w:val="2"/>
               <w:sz w:val="24"/>
               <w:szCs w:val="24"/>
@@ -1290,7 +1256,7 @@
               <w:tab w:val="right" w:pos="9360" w:leader="none"/>
             </w:tabs>
             <w:rPr>
-              <w:rFonts w:ascii="Calibri" w:hAnsi="Calibri" w:eastAsia="" w:cs="Arial" w:asciiTheme="minorHAnsi" w:cstheme="minorBidi" w:eastAsiaTheme="minorEastAsia" w:hAnsiTheme="minorHAnsi"/>
+              <w:rFonts w:ascii="Calibri" w:hAnsi="Calibri" w:eastAsia="" w:cs="" w:asciiTheme="minorHAnsi" w:cstheme="minorBidi" w:eastAsiaTheme="minorEastAsia" w:hAnsiTheme="minorHAnsi"/>
               <w:kern w:val="2"/>
               <w:sz w:val="24"/>
               <w:szCs w:val="24"/>
@@ -1303,7 +1269,7 @@
           </w:r>
           <w:r>
             <w:rPr>
-              <w:rFonts w:eastAsia="" w:cs="Arial" w:ascii="Calibri" w:hAnsi="Calibri" w:asciiTheme="minorHAnsi" w:cstheme="minorBidi" w:eastAsiaTheme="minorEastAsia" w:hAnsiTheme="minorHAnsi"/>
+              <w:rFonts w:eastAsia="" w:cs="" w:ascii="Calibri" w:hAnsi="Calibri" w:asciiTheme="minorHAnsi" w:cstheme="minorBidi" w:eastAsiaTheme="minorEastAsia" w:hAnsiTheme="minorHAnsi"/>
               <w:kern w:val="2"/>
               <w:sz w:val="24"/>
               <w:szCs w:val="24"/>
@@ -1326,7 +1292,7 @@
               <w:tab w:val="right" w:pos="9360" w:leader="none"/>
             </w:tabs>
             <w:rPr>
-              <w:rFonts w:ascii="Calibri" w:hAnsi="Calibri" w:eastAsia="" w:cs="Arial" w:asciiTheme="minorHAnsi" w:cstheme="minorBidi" w:eastAsiaTheme="minorEastAsia" w:hAnsiTheme="minorHAnsi"/>
+              <w:rFonts w:ascii="Calibri" w:hAnsi="Calibri" w:eastAsia="" w:cs="" w:asciiTheme="minorHAnsi" w:cstheme="minorBidi" w:eastAsiaTheme="minorEastAsia" w:hAnsiTheme="minorHAnsi"/>
               <w:kern w:val="2"/>
               <w:sz w:val="24"/>
               <w:szCs w:val="24"/>
@@ -1339,7 +1305,7 @@
           </w:r>
           <w:r>
             <w:rPr>
-              <w:rFonts w:eastAsia="" w:cs="Arial" w:ascii="Calibri" w:hAnsi="Calibri" w:asciiTheme="minorHAnsi" w:cstheme="minorBidi" w:eastAsiaTheme="minorEastAsia" w:hAnsiTheme="minorHAnsi"/>
+              <w:rFonts w:eastAsia="" w:cs="" w:ascii="Calibri" w:hAnsi="Calibri" w:asciiTheme="minorHAnsi" w:cstheme="minorBidi" w:eastAsiaTheme="minorEastAsia" w:hAnsiTheme="minorHAnsi"/>
               <w:kern w:val="2"/>
               <w:sz w:val="24"/>
               <w:szCs w:val="24"/>
@@ -1362,7 +1328,7 @@
               <w:tab w:val="right" w:pos="9360" w:leader="none"/>
             </w:tabs>
             <w:rPr>
-              <w:rFonts w:ascii="Calibri" w:hAnsi="Calibri" w:eastAsia="" w:cs="Arial" w:asciiTheme="minorHAnsi" w:cstheme="minorBidi" w:eastAsiaTheme="minorEastAsia" w:hAnsiTheme="minorHAnsi"/>
+              <w:rFonts w:ascii="Calibri" w:hAnsi="Calibri" w:eastAsia="" w:cs="" w:asciiTheme="minorHAnsi" w:cstheme="minorBidi" w:eastAsiaTheme="minorEastAsia" w:hAnsiTheme="minorHAnsi"/>
               <w:kern w:val="2"/>
               <w:sz w:val="24"/>
               <w:szCs w:val="24"/>
@@ -1375,7 +1341,7 @@
           </w:r>
           <w:r>
             <w:rPr>
-              <w:rFonts w:eastAsia="" w:cs="Arial" w:ascii="Calibri" w:hAnsi="Calibri" w:asciiTheme="minorHAnsi" w:cstheme="minorBidi" w:eastAsiaTheme="minorEastAsia" w:hAnsiTheme="minorHAnsi"/>
+              <w:rFonts w:eastAsia="" w:cs="" w:ascii="Calibri" w:hAnsi="Calibri" w:asciiTheme="minorHAnsi" w:cstheme="minorBidi" w:eastAsiaTheme="minorEastAsia" w:hAnsiTheme="minorHAnsi"/>
               <w:kern w:val="2"/>
               <w:sz w:val="24"/>
               <w:szCs w:val="24"/>
@@ -1398,7 +1364,7 @@
               <w:tab w:val="right" w:pos="9360" w:leader="none"/>
             </w:tabs>
             <w:rPr>
-              <w:rFonts w:ascii="Calibri" w:hAnsi="Calibri" w:eastAsia="" w:cs="Arial" w:asciiTheme="minorHAnsi" w:cstheme="minorBidi" w:eastAsiaTheme="minorEastAsia" w:hAnsiTheme="minorHAnsi"/>
+              <w:rFonts w:ascii="Calibri" w:hAnsi="Calibri" w:eastAsia="" w:cs="" w:asciiTheme="minorHAnsi" w:cstheme="minorBidi" w:eastAsiaTheme="minorEastAsia" w:hAnsiTheme="minorHAnsi"/>
               <w:kern w:val="2"/>
               <w:sz w:val="24"/>
               <w:szCs w:val="24"/>
@@ -1411,7 +1377,7 @@
           </w:r>
           <w:r>
             <w:rPr>
-              <w:rFonts w:eastAsia="" w:cs="Arial" w:ascii="Calibri" w:hAnsi="Calibri" w:asciiTheme="minorHAnsi" w:cstheme="minorBidi" w:eastAsiaTheme="minorEastAsia" w:hAnsiTheme="minorHAnsi"/>
+              <w:rFonts w:eastAsia="" w:cs="" w:ascii="Calibri" w:hAnsi="Calibri" w:asciiTheme="minorHAnsi" w:cstheme="minorBidi" w:eastAsiaTheme="minorEastAsia" w:hAnsiTheme="minorHAnsi"/>
               <w:kern w:val="2"/>
               <w:sz w:val="24"/>
               <w:szCs w:val="24"/>
@@ -1434,7 +1400,7 @@
               <w:tab w:val="right" w:pos="9360" w:leader="none"/>
             </w:tabs>
             <w:rPr>
-              <w:rFonts w:ascii="Calibri" w:hAnsi="Calibri" w:eastAsia="" w:cs="Arial" w:asciiTheme="minorHAnsi" w:cstheme="minorBidi" w:eastAsiaTheme="minorEastAsia" w:hAnsiTheme="minorHAnsi"/>
+              <w:rFonts w:ascii="Calibri" w:hAnsi="Calibri" w:eastAsia="" w:cs="" w:asciiTheme="minorHAnsi" w:cstheme="minorBidi" w:eastAsiaTheme="minorEastAsia" w:hAnsiTheme="minorHAnsi"/>
               <w:kern w:val="2"/>
               <w:sz w:val="24"/>
               <w:szCs w:val="24"/>
@@ -1447,7 +1413,7 @@
           </w:r>
           <w:r>
             <w:rPr>
-              <w:rFonts w:eastAsia="" w:cs="Arial" w:ascii="Calibri" w:hAnsi="Calibri" w:asciiTheme="minorHAnsi" w:cstheme="minorBidi" w:eastAsiaTheme="minorEastAsia" w:hAnsiTheme="minorHAnsi"/>
+              <w:rFonts w:eastAsia="" w:cs="" w:ascii="Calibri" w:hAnsi="Calibri" w:asciiTheme="minorHAnsi" w:cstheme="minorBidi" w:eastAsiaTheme="minorEastAsia" w:hAnsiTheme="minorHAnsi"/>
               <w:kern w:val="2"/>
               <w:sz w:val="24"/>
               <w:szCs w:val="24"/>
@@ -1470,7 +1436,7 @@
               <w:tab w:val="right" w:pos="9360" w:leader="none"/>
             </w:tabs>
             <w:rPr>
-              <w:rFonts w:ascii="Calibri" w:hAnsi="Calibri" w:eastAsia="" w:cs="Arial" w:asciiTheme="minorHAnsi" w:cstheme="minorBidi" w:eastAsiaTheme="minorEastAsia" w:hAnsiTheme="minorHAnsi"/>
+              <w:rFonts w:ascii="Calibri" w:hAnsi="Calibri" w:eastAsia="" w:cs="" w:asciiTheme="minorHAnsi" w:cstheme="minorBidi" w:eastAsiaTheme="minorEastAsia" w:hAnsiTheme="minorHAnsi"/>
               <w:kern w:val="2"/>
               <w:sz w:val="24"/>
               <w:szCs w:val="24"/>
@@ -1483,7 +1449,7 @@
           </w:r>
           <w:r>
             <w:rPr>
-              <w:rFonts w:eastAsia="" w:cs="Arial" w:ascii="Calibri" w:hAnsi="Calibri" w:asciiTheme="minorHAnsi" w:cstheme="minorBidi" w:eastAsiaTheme="minorEastAsia" w:hAnsiTheme="minorHAnsi"/>
+              <w:rFonts w:eastAsia="" w:cs="" w:ascii="Calibri" w:hAnsi="Calibri" w:asciiTheme="minorHAnsi" w:cstheme="minorBidi" w:eastAsiaTheme="minorEastAsia" w:hAnsiTheme="minorHAnsi"/>
               <w:kern w:val="2"/>
               <w:sz w:val="24"/>
               <w:szCs w:val="24"/>
@@ -1502,7 +1468,7 @@
           <w:pPr>
             <w:pStyle w:val="TOC3"/>
             <w:rPr>
-              <w:rFonts w:ascii="Calibri" w:hAnsi="Calibri" w:eastAsia="" w:cs="Arial" w:asciiTheme="minorHAnsi" w:cstheme="minorBidi" w:eastAsiaTheme="minorEastAsia" w:hAnsiTheme="minorHAnsi"/>
+              <w:rFonts w:ascii="Calibri" w:hAnsi="Calibri" w:eastAsia="" w:cs="" w:asciiTheme="minorHAnsi" w:cstheme="minorBidi" w:eastAsiaTheme="minorEastAsia" w:hAnsiTheme="minorHAnsi"/>
               <w:kern w:val="2"/>
               <w:sz w:val="24"/>
               <w:szCs w:val="24"/>
@@ -1515,7 +1481,7 @@
           </w:r>
           <w:r>
             <w:rPr>
-              <w:rFonts w:eastAsia="" w:cs="Arial" w:ascii="Calibri" w:hAnsi="Calibri" w:asciiTheme="minorHAnsi" w:cstheme="minorBidi" w:eastAsiaTheme="minorEastAsia" w:hAnsiTheme="minorHAnsi"/>
+              <w:rFonts w:eastAsia="" w:cs="" w:ascii="Calibri" w:hAnsi="Calibri" w:asciiTheme="minorHAnsi" w:cstheme="minorBidi" w:eastAsiaTheme="minorEastAsia" w:hAnsiTheme="minorHAnsi"/>
               <w:kern w:val="2"/>
               <w:sz w:val="24"/>
               <w:szCs w:val="24"/>
@@ -1538,7 +1504,7 @@
               <w:tab w:val="right" w:pos="9360" w:leader="none"/>
             </w:tabs>
             <w:rPr>
-              <w:rFonts w:ascii="Calibri" w:hAnsi="Calibri" w:eastAsia="" w:cs="Arial" w:asciiTheme="minorHAnsi" w:cstheme="minorBidi" w:eastAsiaTheme="minorEastAsia" w:hAnsiTheme="minorHAnsi"/>
+              <w:rFonts w:ascii="Calibri" w:hAnsi="Calibri" w:eastAsia="" w:cs="" w:asciiTheme="minorHAnsi" w:cstheme="minorBidi" w:eastAsiaTheme="minorEastAsia" w:hAnsiTheme="minorHAnsi"/>
               <w:kern w:val="2"/>
               <w:sz w:val="24"/>
               <w:szCs w:val="24"/>
@@ -1551,7 +1517,7 @@
           </w:r>
           <w:r>
             <w:rPr>
-              <w:rFonts w:eastAsia="" w:cs="Arial" w:ascii="Calibri" w:hAnsi="Calibri" w:asciiTheme="minorHAnsi" w:cstheme="minorBidi" w:eastAsiaTheme="minorEastAsia" w:hAnsiTheme="minorHAnsi"/>
+              <w:rFonts w:eastAsia="" w:cs="" w:ascii="Calibri" w:hAnsi="Calibri" w:asciiTheme="minorHAnsi" w:cstheme="minorBidi" w:eastAsiaTheme="minorEastAsia" w:hAnsiTheme="minorHAnsi"/>
               <w:kern w:val="2"/>
               <w:sz w:val="24"/>
               <w:szCs w:val="24"/>
@@ -1574,7 +1540,7 @@
               <w:tab w:val="right" w:pos="9360" w:leader="none"/>
             </w:tabs>
             <w:rPr>
-              <w:rFonts w:ascii="Calibri" w:hAnsi="Calibri" w:eastAsia="" w:cs="Arial" w:asciiTheme="minorHAnsi" w:cstheme="minorBidi" w:eastAsiaTheme="minorEastAsia" w:hAnsiTheme="minorHAnsi"/>
+              <w:rFonts w:ascii="Calibri" w:hAnsi="Calibri" w:eastAsia="" w:cs="" w:asciiTheme="minorHAnsi" w:cstheme="minorBidi" w:eastAsiaTheme="minorEastAsia" w:hAnsiTheme="minorHAnsi"/>
               <w:kern w:val="2"/>
               <w:sz w:val="24"/>
               <w:szCs w:val="24"/>
@@ -1587,7 +1553,7 @@
           </w:r>
           <w:r>
             <w:rPr>
-              <w:rFonts w:eastAsia="" w:cs="Arial" w:ascii="Calibri" w:hAnsi="Calibri" w:asciiTheme="minorHAnsi" w:cstheme="minorBidi" w:eastAsiaTheme="minorEastAsia" w:hAnsiTheme="minorHAnsi"/>
+              <w:rFonts w:eastAsia="" w:cs="" w:ascii="Calibri" w:hAnsi="Calibri" w:asciiTheme="minorHAnsi" w:cstheme="minorBidi" w:eastAsiaTheme="minorEastAsia" w:hAnsiTheme="minorHAnsi"/>
               <w:kern w:val="2"/>
               <w:sz w:val="24"/>
               <w:szCs w:val="24"/>
@@ -1610,7 +1576,7 @@
               <w:tab w:val="right" w:pos="9360" w:leader="none"/>
             </w:tabs>
             <w:rPr>
-              <w:rFonts w:ascii="Calibri" w:hAnsi="Calibri" w:eastAsia="" w:cs="Arial" w:asciiTheme="minorHAnsi" w:cstheme="minorBidi" w:eastAsiaTheme="minorEastAsia" w:hAnsiTheme="minorHAnsi"/>
+              <w:rFonts w:ascii="Calibri" w:hAnsi="Calibri" w:eastAsia="" w:cs="" w:asciiTheme="minorHAnsi" w:cstheme="minorBidi" w:eastAsiaTheme="minorEastAsia" w:hAnsiTheme="minorHAnsi"/>
               <w:kern w:val="2"/>
               <w:sz w:val="24"/>
               <w:szCs w:val="24"/>
@@ -1623,7 +1589,7 @@
           </w:r>
           <w:r>
             <w:rPr>
-              <w:rFonts w:eastAsia="" w:cs="Arial" w:ascii="Calibri" w:hAnsi="Calibri" w:asciiTheme="minorHAnsi" w:cstheme="minorBidi" w:eastAsiaTheme="minorEastAsia" w:hAnsiTheme="minorHAnsi"/>
+              <w:rFonts w:eastAsia="" w:cs="" w:ascii="Calibri" w:hAnsi="Calibri" w:asciiTheme="minorHAnsi" w:cstheme="minorBidi" w:eastAsiaTheme="minorEastAsia" w:hAnsiTheme="minorHAnsi"/>
               <w:kern w:val="2"/>
               <w:sz w:val="24"/>
               <w:szCs w:val="24"/>
@@ -1646,7 +1612,7 @@
               <w:tab w:val="right" w:pos="9360" w:leader="none"/>
             </w:tabs>
             <w:rPr>
-              <w:rFonts w:ascii="Calibri" w:hAnsi="Calibri" w:eastAsia="" w:cs="Arial" w:asciiTheme="minorHAnsi" w:cstheme="minorBidi" w:eastAsiaTheme="minorEastAsia" w:hAnsiTheme="minorHAnsi"/>
+              <w:rFonts w:ascii="Calibri" w:hAnsi="Calibri" w:eastAsia="" w:cs="" w:asciiTheme="minorHAnsi" w:cstheme="minorBidi" w:eastAsiaTheme="minorEastAsia" w:hAnsiTheme="minorHAnsi"/>
               <w:kern w:val="2"/>
               <w:sz w:val="24"/>
               <w:szCs w:val="24"/>
@@ -1659,7 +1625,7 @@
           </w:r>
           <w:r>
             <w:rPr>
-              <w:rFonts w:eastAsia="" w:cs="Arial" w:ascii="Calibri" w:hAnsi="Calibri" w:asciiTheme="minorHAnsi" w:cstheme="minorBidi" w:eastAsiaTheme="minorEastAsia" w:hAnsiTheme="minorHAnsi"/>
+              <w:rFonts w:eastAsia="" w:cs="" w:ascii="Calibri" w:hAnsi="Calibri" w:asciiTheme="minorHAnsi" w:cstheme="minorBidi" w:eastAsiaTheme="minorEastAsia" w:hAnsiTheme="minorHAnsi"/>
               <w:kern w:val="2"/>
               <w:sz w:val="24"/>
               <w:szCs w:val="24"/>
@@ -1682,7 +1648,7 @@
               <w:tab w:val="right" w:pos="9360" w:leader="none"/>
             </w:tabs>
             <w:rPr>
-              <w:rFonts w:ascii="Calibri" w:hAnsi="Calibri" w:eastAsia="" w:cs="Arial" w:asciiTheme="minorHAnsi" w:cstheme="minorBidi" w:eastAsiaTheme="minorEastAsia" w:hAnsiTheme="minorHAnsi"/>
+              <w:rFonts w:ascii="Calibri" w:hAnsi="Calibri" w:eastAsia="" w:cs="" w:asciiTheme="minorHAnsi" w:cstheme="minorBidi" w:eastAsiaTheme="minorEastAsia" w:hAnsiTheme="minorHAnsi"/>
               <w:kern w:val="2"/>
               <w:sz w:val="24"/>
               <w:szCs w:val="24"/>
@@ -1695,7 +1661,7 @@
           </w:r>
           <w:r>
             <w:rPr>
-              <w:rFonts w:eastAsia="" w:cs="Arial" w:ascii="Calibri" w:hAnsi="Calibri" w:asciiTheme="minorHAnsi" w:cstheme="minorBidi" w:eastAsiaTheme="minorEastAsia" w:hAnsiTheme="minorHAnsi"/>
+              <w:rFonts w:eastAsia="" w:cs="" w:ascii="Calibri" w:hAnsi="Calibri" w:asciiTheme="minorHAnsi" w:cstheme="minorBidi" w:eastAsiaTheme="minorEastAsia" w:hAnsiTheme="minorHAnsi"/>
               <w:kern w:val="2"/>
               <w:sz w:val="24"/>
               <w:szCs w:val="24"/>
@@ -1718,7 +1684,7 @@
               <w:tab w:val="right" w:pos="9360" w:leader="none"/>
             </w:tabs>
             <w:rPr>
-              <w:rFonts w:ascii="Calibri" w:hAnsi="Calibri" w:eastAsia="" w:cs="Arial" w:asciiTheme="minorHAnsi" w:cstheme="minorBidi" w:eastAsiaTheme="minorEastAsia" w:hAnsiTheme="minorHAnsi"/>
+              <w:rFonts w:ascii="Calibri" w:hAnsi="Calibri" w:eastAsia="" w:cs="" w:asciiTheme="minorHAnsi" w:cstheme="minorBidi" w:eastAsiaTheme="minorEastAsia" w:hAnsiTheme="minorHAnsi"/>
               <w:kern w:val="2"/>
               <w:sz w:val="24"/>
               <w:szCs w:val="24"/>
@@ -1731,7 +1697,7 @@
           </w:r>
           <w:r>
             <w:rPr>
-              <w:rFonts w:eastAsia="" w:cs="Arial" w:ascii="Calibri" w:hAnsi="Calibri" w:asciiTheme="minorHAnsi" w:cstheme="minorBidi" w:eastAsiaTheme="minorEastAsia" w:hAnsiTheme="minorHAnsi"/>
+              <w:rFonts w:eastAsia="" w:cs="" w:ascii="Calibri" w:hAnsi="Calibri" w:asciiTheme="minorHAnsi" w:cstheme="minorBidi" w:eastAsiaTheme="minorEastAsia" w:hAnsiTheme="minorHAnsi"/>
               <w:kern w:val="2"/>
               <w:sz w:val="24"/>
               <w:szCs w:val="24"/>
@@ -1754,7 +1720,7 @@
               <w:tab w:val="right" w:pos="9360" w:leader="none"/>
             </w:tabs>
             <w:rPr>
-              <w:rFonts w:ascii="Calibri" w:hAnsi="Calibri" w:eastAsia="" w:cs="Arial" w:asciiTheme="minorHAnsi" w:cstheme="minorBidi" w:eastAsiaTheme="minorEastAsia" w:hAnsiTheme="minorHAnsi"/>
+              <w:rFonts w:ascii="Calibri" w:hAnsi="Calibri" w:eastAsia="" w:cs="" w:asciiTheme="minorHAnsi" w:cstheme="minorBidi" w:eastAsiaTheme="minorEastAsia" w:hAnsiTheme="minorHAnsi"/>
               <w:kern w:val="2"/>
               <w:sz w:val="24"/>
               <w:szCs w:val="24"/>
@@ -1767,7 +1733,7 @@
           </w:r>
           <w:r>
             <w:rPr>
-              <w:rFonts w:eastAsia="" w:cs="Arial" w:ascii="Calibri" w:hAnsi="Calibri" w:asciiTheme="minorHAnsi" w:cstheme="minorBidi" w:eastAsiaTheme="minorEastAsia" w:hAnsiTheme="minorHAnsi"/>
+              <w:rFonts w:eastAsia="" w:cs="" w:ascii="Calibri" w:hAnsi="Calibri" w:asciiTheme="minorHAnsi" w:cstheme="minorBidi" w:eastAsiaTheme="minorEastAsia" w:hAnsiTheme="minorHAnsi"/>
               <w:kern w:val="2"/>
               <w:sz w:val="24"/>
               <w:szCs w:val="24"/>
@@ -1786,7 +1752,7 @@
           <w:pPr>
             <w:pStyle w:val="TOC3"/>
             <w:rPr>
-              <w:rFonts w:ascii="Calibri" w:hAnsi="Calibri" w:eastAsia="" w:cs="Arial" w:asciiTheme="minorHAnsi" w:cstheme="minorBidi" w:eastAsiaTheme="minorEastAsia" w:hAnsiTheme="minorHAnsi"/>
+              <w:rFonts w:ascii="Calibri" w:hAnsi="Calibri" w:eastAsia="" w:cs="" w:asciiTheme="minorHAnsi" w:cstheme="minorBidi" w:eastAsiaTheme="minorEastAsia" w:hAnsiTheme="minorHAnsi"/>
               <w:kern w:val="2"/>
               <w:sz w:val="24"/>
               <w:szCs w:val="24"/>
@@ -1799,7 +1765,7 @@
           </w:r>
           <w:r>
             <w:rPr>
-              <w:rFonts w:eastAsia="" w:cs="Arial" w:ascii="Calibri" w:hAnsi="Calibri" w:asciiTheme="minorHAnsi" w:cstheme="minorBidi" w:eastAsiaTheme="minorEastAsia" w:hAnsiTheme="minorHAnsi"/>
+              <w:rFonts w:eastAsia="" w:cs="" w:ascii="Calibri" w:hAnsi="Calibri" w:asciiTheme="minorHAnsi" w:cstheme="minorBidi" w:eastAsiaTheme="minorEastAsia" w:hAnsiTheme="minorHAnsi"/>
               <w:kern w:val="2"/>
               <w:sz w:val="24"/>
               <w:szCs w:val="24"/>
@@ -1818,7 +1784,7 @@
           <w:pPr>
             <w:pStyle w:val="TOC3"/>
             <w:rPr>
-              <w:rFonts w:ascii="Calibri" w:hAnsi="Calibri" w:eastAsia="" w:cs="Arial" w:asciiTheme="minorHAnsi" w:cstheme="minorBidi" w:eastAsiaTheme="minorEastAsia" w:hAnsiTheme="minorHAnsi"/>
+              <w:rFonts w:ascii="Calibri" w:hAnsi="Calibri" w:eastAsia="" w:cs="" w:asciiTheme="minorHAnsi" w:cstheme="minorBidi" w:eastAsiaTheme="minorEastAsia" w:hAnsiTheme="minorHAnsi"/>
               <w:kern w:val="2"/>
               <w:sz w:val="24"/>
               <w:szCs w:val="24"/>
@@ -1831,7 +1797,7 @@
           </w:r>
           <w:r>
             <w:rPr>
-              <w:rFonts w:eastAsia="" w:cs="Arial" w:ascii="Calibri" w:hAnsi="Calibri" w:asciiTheme="minorHAnsi" w:cstheme="minorBidi" w:eastAsiaTheme="minorEastAsia" w:hAnsiTheme="minorHAnsi"/>
+              <w:rFonts w:eastAsia="" w:cs="" w:ascii="Calibri" w:hAnsi="Calibri" w:asciiTheme="minorHAnsi" w:cstheme="minorBidi" w:eastAsiaTheme="minorEastAsia" w:hAnsiTheme="minorHAnsi"/>
               <w:kern w:val="2"/>
               <w:sz w:val="24"/>
               <w:szCs w:val="24"/>
@@ -1850,7 +1816,7 @@
           <w:pPr>
             <w:pStyle w:val="TOC3"/>
             <w:rPr>
-              <w:rFonts w:ascii="Calibri" w:hAnsi="Calibri" w:eastAsia="" w:cs="Arial" w:asciiTheme="minorHAnsi" w:cstheme="minorBidi" w:eastAsiaTheme="minorEastAsia" w:hAnsiTheme="minorHAnsi"/>
+              <w:rFonts w:ascii="Calibri" w:hAnsi="Calibri" w:eastAsia="" w:cs="" w:asciiTheme="minorHAnsi" w:cstheme="minorBidi" w:eastAsiaTheme="minorEastAsia" w:hAnsiTheme="minorHAnsi"/>
               <w:kern w:val="2"/>
               <w:sz w:val="24"/>
               <w:szCs w:val="24"/>
@@ -1863,7 +1829,7 @@
           </w:r>
           <w:r>
             <w:rPr>
-              <w:rFonts w:eastAsia="" w:cs="Arial" w:ascii="Calibri" w:hAnsi="Calibri" w:asciiTheme="minorHAnsi" w:cstheme="minorBidi" w:eastAsiaTheme="minorEastAsia" w:hAnsiTheme="minorHAnsi"/>
+              <w:rFonts w:eastAsia="" w:cs="" w:ascii="Calibri" w:hAnsi="Calibri" w:asciiTheme="minorHAnsi" w:cstheme="minorBidi" w:eastAsiaTheme="minorEastAsia" w:hAnsiTheme="minorHAnsi"/>
               <w:kern w:val="2"/>
               <w:sz w:val="24"/>
               <w:szCs w:val="24"/>
@@ -1882,7 +1848,7 @@
           <w:pPr>
             <w:pStyle w:val="TOC3"/>
             <w:rPr>
-              <w:rFonts w:ascii="Calibri" w:hAnsi="Calibri" w:eastAsia="" w:cs="Arial" w:asciiTheme="minorHAnsi" w:cstheme="minorBidi" w:eastAsiaTheme="minorEastAsia" w:hAnsiTheme="minorHAnsi"/>
+              <w:rFonts w:ascii="Calibri" w:hAnsi="Calibri" w:eastAsia="" w:cs="" w:asciiTheme="minorHAnsi" w:cstheme="minorBidi" w:eastAsiaTheme="minorEastAsia" w:hAnsiTheme="minorHAnsi"/>
               <w:kern w:val="2"/>
               <w:sz w:val="24"/>
               <w:szCs w:val="24"/>
@@ -1895,7 +1861,7 @@
           </w:r>
           <w:r>
             <w:rPr>
-              <w:rFonts w:eastAsia="" w:cs="Arial" w:ascii="Calibri" w:hAnsi="Calibri" w:asciiTheme="minorHAnsi" w:cstheme="minorBidi" w:eastAsiaTheme="minorEastAsia" w:hAnsiTheme="minorHAnsi"/>
+              <w:rFonts w:eastAsia="" w:cs="" w:ascii="Calibri" w:hAnsi="Calibri" w:asciiTheme="minorHAnsi" w:cstheme="minorBidi" w:eastAsiaTheme="minorEastAsia" w:hAnsiTheme="minorHAnsi"/>
               <w:kern w:val="2"/>
               <w:sz w:val="24"/>
               <w:szCs w:val="24"/>
@@ -1914,7 +1880,7 @@
           <w:pPr>
             <w:pStyle w:val="TOC3"/>
             <w:rPr>
-              <w:rFonts w:ascii="Calibri" w:hAnsi="Calibri" w:eastAsia="" w:cs="Arial" w:asciiTheme="minorHAnsi" w:cstheme="minorBidi" w:eastAsiaTheme="minorEastAsia" w:hAnsiTheme="minorHAnsi"/>
+              <w:rFonts w:ascii="Calibri" w:hAnsi="Calibri" w:eastAsia="" w:cs="" w:asciiTheme="minorHAnsi" w:cstheme="minorBidi" w:eastAsiaTheme="minorEastAsia" w:hAnsiTheme="minorHAnsi"/>
               <w:kern w:val="2"/>
               <w:sz w:val="24"/>
               <w:szCs w:val="24"/>
@@ -1927,7 +1893,7 @@
           </w:r>
           <w:r>
             <w:rPr>
-              <w:rFonts w:eastAsia="" w:cs="Arial" w:ascii="Calibri" w:hAnsi="Calibri" w:asciiTheme="minorHAnsi" w:cstheme="minorBidi" w:eastAsiaTheme="minorEastAsia" w:hAnsiTheme="minorHAnsi"/>
+              <w:rFonts w:eastAsia="" w:cs="" w:ascii="Calibri" w:hAnsi="Calibri" w:asciiTheme="minorHAnsi" w:cstheme="minorBidi" w:eastAsiaTheme="minorEastAsia" w:hAnsiTheme="minorHAnsi"/>
               <w:kern w:val="2"/>
               <w:sz w:val="24"/>
               <w:szCs w:val="24"/>
@@ -1950,7 +1916,7 @@
               <w:tab w:val="right" w:pos="9360" w:leader="none"/>
             </w:tabs>
             <w:rPr>
-              <w:rFonts w:ascii="Calibri" w:hAnsi="Calibri" w:eastAsia="" w:cs="Arial" w:asciiTheme="minorHAnsi" w:cstheme="minorBidi" w:eastAsiaTheme="minorEastAsia" w:hAnsiTheme="minorHAnsi"/>
+              <w:rFonts w:ascii="Calibri" w:hAnsi="Calibri" w:eastAsia="" w:cs="" w:asciiTheme="minorHAnsi" w:cstheme="minorBidi" w:eastAsiaTheme="minorEastAsia" w:hAnsiTheme="minorHAnsi"/>
               <w:kern w:val="2"/>
               <w:sz w:val="24"/>
               <w:szCs w:val="24"/>
@@ -1963,7 +1929,7 @@
           </w:r>
           <w:r>
             <w:rPr>
-              <w:rFonts w:eastAsia="" w:cs="Arial" w:ascii="Calibri" w:hAnsi="Calibri" w:asciiTheme="minorHAnsi" w:cstheme="minorBidi" w:eastAsiaTheme="minorEastAsia" w:hAnsiTheme="minorHAnsi"/>
+              <w:rFonts w:eastAsia="" w:cs="" w:ascii="Calibri" w:hAnsi="Calibri" w:asciiTheme="minorHAnsi" w:cstheme="minorBidi" w:eastAsiaTheme="minorEastAsia" w:hAnsiTheme="minorHAnsi"/>
               <w:kern w:val="2"/>
               <w:sz w:val="24"/>
               <w:szCs w:val="24"/>
@@ -1986,7 +1952,7 @@
               <w:tab w:val="right" w:pos="9360" w:leader="none"/>
             </w:tabs>
             <w:rPr>
-              <w:rFonts w:ascii="Calibri" w:hAnsi="Calibri" w:eastAsia="" w:cs="Arial" w:asciiTheme="minorHAnsi" w:cstheme="minorBidi" w:eastAsiaTheme="minorEastAsia" w:hAnsiTheme="minorHAnsi"/>
+              <w:rFonts w:ascii="Calibri" w:hAnsi="Calibri" w:eastAsia="" w:cs="" w:asciiTheme="minorHAnsi" w:cstheme="minorBidi" w:eastAsiaTheme="minorEastAsia" w:hAnsiTheme="minorHAnsi"/>
               <w:kern w:val="2"/>
               <w:sz w:val="24"/>
               <w:szCs w:val="24"/>
@@ -1999,7 +1965,7 @@
           </w:r>
           <w:r>
             <w:rPr>
-              <w:rFonts w:eastAsia="" w:cs="Arial" w:ascii="Calibri" w:hAnsi="Calibri" w:asciiTheme="minorHAnsi" w:cstheme="minorBidi" w:eastAsiaTheme="minorEastAsia" w:hAnsiTheme="minorHAnsi"/>
+              <w:rFonts w:eastAsia="" w:cs="" w:ascii="Calibri" w:hAnsi="Calibri" w:asciiTheme="minorHAnsi" w:cstheme="minorBidi" w:eastAsiaTheme="minorEastAsia" w:hAnsiTheme="minorHAnsi"/>
               <w:kern w:val="2"/>
               <w:sz w:val="24"/>
               <w:szCs w:val="24"/>
@@ -2070,8 +2036,8 @@
         <w:ind w:hanging="720" w:left="720"/>
         <w:rPr/>
       </w:pPr>
-      <w:bookmarkStart w:id="0" w:name="_Toc226825428"/>
-      <w:bookmarkStart w:id="1" w:name="_Toc456598586"/>
+      <w:bookmarkStart w:id="0" w:name="_Toc456598586"/>
+      <w:bookmarkStart w:id="1" w:name="_Toc226825428"/>
       <w:r>
         <w:rPr/>
         <w:t>Introduction</w:t>
@@ -2085,8 +2051,8 @@
         <w:ind w:hanging="720" w:left="720"/>
         <w:rPr/>
       </w:pPr>
-      <w:bookmarkStart w:id="2" w:name="_Toc226825429"/>
-      <w:bookmarkStart w:id="3" w:name="_Toc456598587"/>
+      <w:bookmarkStart w:id="2" w:name="_Toc456598587"/>
+      <w:bookmarkStart w:id="3" w:name="_Toc226825429"/>
       <w:r>
         <w:rPr/>
         <w:t>Purpose</w:t>
@@ -2104,7 +2070,6 @@
           <w:szCs w:val="20"/>
         </w:rPr>
       </w:pPr>
-      <w:bookmarkStart w:id="4" w:name="_Toc456598588"/>
       <w:r>
         <w:rPr>
           <w:sz w:val="20"/>
@@ -2137,14 +2102,14 @@
         <w:ind w:hanging="720" w:left="720"/>
         <w:rPr/>
       </w:pPr>
+      <w:bookmarkStart w:id="4" w:name="_Toc226825430"/>
       <w:bookmarkStart w:id="5" w:name="_Toc456598588"/>
-      <w:bookmarkStart w:id="6" w:name="_Toc226825430"/>
       <w:r>
         <w:rPr/>
         <w:t>Scope</w:t>
       </w:r>
+      <w:bookmarkEnd w:id="4"/>
       <w:bookmarkEnd w:id="5"/>
-      <w:bookmarkEnd w:id="6"/>
     </w:p>
     <w:p>
       <w:pPr>
@@ -2156,7 +2121,6 @@
           <w:szCs w:val="20"/>
         </w:rPr>
       </w:pPr>
-      <w:bookmarkStart w:id="7" w:name="_Toc456598589"/>
       <w:r>
         <w:rPr>
           <w:sz w:val="20"/>
@@ -2186,14 +2150,14 @@
         <w:ind w:hanging="720" w:left="720"/>
         <w:rPr/>
       </w:pPr>
-      <w:bookmarkStart w:id="8" w:name="_Toc456598589"/>
-      <w:bookmarkStart w:id="9" w:name="_Toc226825431"/>
+      <w:bookmarkStart w:id="6" w:name="_Toc226825431"/>
+      <w:bookmarkStart w:id="7" w:name="_Toc456598589"/>
       <w:r>
         <w:rPr/>
         <w:t>Definitions, Acronyms, and Abbreviations</w:t>
       </w:r>
-      <w:bookmarkEnd w:id="8"/>
-      <w:bookmarkEnd w:id="9"/>
+      <w:bookmarkEnd w:id="6"/>
+      <w:bookmarkEnd w:id="7"/>
     </w:p>
     <w:tbl>
       <w:tblPr>
@@ -2224,6 +2188,7 @@
           <w:p>
             <w:pPr>
               <w:pStyle w:val="BodyText"/>
+              <w:suppressAutoHyphens w:val="true"/>
               <w:spacing w:before="0" w:after="120"/>
               <w:ind w:left="0"/>
               <w:jc w:val="left"/>
@@ -2254,6 +2219,7 @@
           <w:p>
             <w:pPr>
               <w:pStyle w:val="BodyText"/>
+              <w:suppressAutoHyphens w:val="true"/>
               <w:spacing w:before="0" w:after="120"/>
               <w:ind w:left="0"/>
               <w:jc w:val="center"/>
@@ -2287,6 +2253,7 @@
           <w:p>
             <w:pPr>
               <w:pStyle w:val="BodyText"/>
+              <w:suppressAutoHyphens w:val="true"/>
               <w:spacing w:before="0" w:after="120"/>
               <w:ind w:left="0"/>
               <w:jc w:val="left"/>
@@ -2318,6 +2285,7 @@
           <w:p>
             <w:pPr>
               <w:pStyle w:val="BodyText"/>
+              <w:suppressAutoHyphens w:val="true"/>
               <w:spacing w:before="0" w:after="120"/>
               <w:ind w:left="0"/>
               <w:jc w:val="left"/>
@@ -2352,6 +2320,7 @@
           <w:p>
             <w:pPr>
               <w:pStyle w:val="BodyText"/>
+              <w:suppressAutoHyphens w:val="true"/>
               <w:spacing w:before="0" w:after="120"/>
               <w:ind w:left="0"/>
               <w:jc w:val="left"/>
@@ -2383,6 +2352,7 @@
           <w:p>
             <w:pPr>
               <w:pStyle w:val="BodyText"/>
+              <w:suppressAutoHyphens w:val="true"/>
               <w:spacing w:before="0" w:after="120"/>
               <w:ind w:left="0"/>
               <w:jc w:val="left"/>
@@ -2417,6 +2387,7 @@
           <w:p>
             <w:pPr>
               <w:pStyle w:val="BodyText"/>
+              <w:suppressAutoHyphens w:val="true"/>
               <w:spacing w:before="0" w:after="120"/>
               <w:ind w:left="0"/>
               <w:jc w:val="left"/>
@@ -2448,6 +2419,7 @@
           <w:p>
             <w:pPr>
               <w:pStyle w:val="BodyText"/>
+              <w:suppressAutoHyphens w:val="true"/>
               <w:spacing w:before="0" w:after="120"/>
               <w:ind w:left="0"/>
               <w:jc w:val="left"/>
@@ -2500,14 +2472,14 @@
         <w:ind w:hanging="720" w:left="720"/>
         <w:rPr/>
       </w:pPr>
-      <w:bookmarkStart w:id="10" w:name="_Toc226825432"/>
-      <w:bookmarkStart w:id="11" w:name="_Toc456598590"/>
+      <w:bookmarkStart w:id="8" w:name="_Toc456598590"/>
+      <w:bookmarkStart w:id="9" w:name="_Toc226825432"/>
       <w:r>
         <w:rPr/>
         <w:t>References</w:t>
       </w:r>
-      <w:bookmarkEnd w:id="10"/>
-      <w:bookmarkEnd w:id="11"/>
+      <w:bookmarkEnd w:id="8"/>
+      <w:bookmarkEnd w:id="9"/>
     </w:p>
     <w:p>
       <w:pPr>
@@ -2554,14 +2526,14 @@
         <w:ind w:hanging="720" w:left="720"/>
         <w:rPr/>
       </w:pPr>
-      <w:bookmarkStart w:id="12" w:name="_Toc226825433"/>
-      <w:bookmarkStart w:id="13" w:name="_Toc456598591"/>
+      <w:bookmarkStart w:id="10" w:name="_Toc456598591"/>
+      <w:bookmarkStart w:id="11" w:name="_Toc226825433"/>
       <w:r>
         <w:rPr/>
         <w:t>Overview</w:t>
       </w:r>
-      <w:bookmarkEnd w:id="12"/>
-      <w:bookmarkEnd w:id="13"/>
+      <w:bookmarkEnd w:id="10"/>
+      <w:bookmarkEnd w:id="11"/>
     </w:p>
     <w:p>
       <w:pPr>
@@ -2762,12 +2734,12 @@
         <w:ind w:hanging="720" w:left="720"/>
         <w:rPr/>
       </w:pPr>
-      <w:bookmarkStart w:id="14" w:name="_Toc226825434"/>
+      <w:bookmarkStart w:id="12" w:name="_Toc226825434"/>
       <w:r>
         <w:rPr/>
         <w:t>Architectural Representation</w:t>
       </w:r>
-      <w:bookmarkEnd w:id="14"/>
+      <w:bookmarkEnd w:id="12"/>
       <w:r>
         <w:rPr/>
         <w:t xml:space="preserve"> </w:t>
@@ -2799,12 +2771,12 @@
         <w:ind w:hanging="720" w:left="720"/>
         <w:rPr/>
       </w:pPr>
-      <w:bookmarkStart w:id="15" w:name="_Toc226825435"/>
+      <w:bookmarkStart w:id="13" w:name="_Toc226825435"/>
       <w:r>
         <w:rPr/>
         <w:t>User I/O</w:t>
       </w:r>
-      <w:bookmarkEnd w:id="15"/>
+      <w:bookmarkEnd w:id="13"/>
     </w:p>
     <w:p>
       <w:pPr>
@@ -2856,12 +2828,12 @@
         <w:ind w:hanging="720" w:left="720"/>
         <w:rPr/>
       </w:pPr>
-      <w:bookmarkStart w:id="16" w:name="_Toc226825436"/>
+      <w:bookmarkStart w:id="14" w:name="_Toc226825436"/>
       <w:r>
         <w:rPr/>
         <w:t>Tokenizer</w:t>
       </w:r>
-      <w:bookmarkEnd w:id="16"/>
+      <w:bookmarkEnd w:id="14"/>
     </w:p>
     <w:p>
       <w:pPr>
@@ -2913,12 +2885,12 @@
         <w:ind w:hanging="720" w:left="720"/>
         <w:rPr/>
       </w:pPr>
-      <w:bookmarkStart w:id="17" w:name="_Toc226825437"/>
+      <w:bookmarkStart w:id="15" w:name="_Toc226825437"/>
       <w:r>
         <w:rPr/>
         <w:t>Token Object Types</w:t>
       </w:r>
-      <w:bookmarkEnd w:id="17"/>
+      <w:bookmarkEnd w:id="15"/>
     </w:p>
     <w:p>
       <w:pPr>
@@ -3002,12 +2974,12 @@
         <w:ind w:hanging="720" w:left="720"/>
         <w:rPr/>
       </w:pPr>
-      <w:bookmarkStart w:id="18" w:name="_Toc226825438"/>
+      <w:bookmarkStart w:id="16" w:name="_Toc226825438"/>
       <w:r>
         <w:rPr/>
         <w:t>Parser</w:t>
       </w:r>
-      <w:bookmarkEnd w:id="18"/>
+      <w:bookmarkEnd w:id="16"/>
     </w:p>
     <w:p>
       <w:pPr>
@@ -3070,12 +3042,12 @@
         <w:ind w:hanging="720" w:left="720"/>
         <w:rPr/>
       </w:pPr>
-      <w:bookmarkStart w:id="19" w:name="_Toc226825439"/>
+      <w:bookmarkStart w:id="17" w:name="_Toc226825439"/>
       <w:r>
         <w:rPr/>
         <w:t>Evaluator</w:t>
       </w:r>
-      <w:bookmarkEnd w:id="19"/>
+      <w:bookmarkEnd w:id="17"/>
     </w:p>
     <w:p>
       <w:pPr>
@@ -3127,12 +3099,12 @@
         <w:ind w:hanging="720" w:left="720"/>
         <w:rPr/>
       </w:pPr>
-      <w:bookmarkStart w:id="20" w:name="_Toc226825440"/>
+      <w:bookmarkStart w:id="18" w:name="_Toc226825440"/>
       <w:r>
         <w:rPr/>
         <w:t>Program Controller</w:t>
       </w:r>
-      <w:bookmarkEnd w:id="20"/>
+      <w:bookmarkEnd w:id="18"/>
     </w:p>
     <w:p>
       <w:pPr>
@@ -3162,12 +3134,12 @@
         <w:ind w:hanging="720" w:left="720"/>
         <w:rPr/>
       </w:pPr>
-      <w:bookmarkStart w:id="21" w:name="_Toc226825441"/>
+      <w:bookmarkStart w:id="19" w:name="_Toc226825441"/>
       <w:r>
         <w:rPr/>
         <w:t>Architectural Goals and Constraints</w:t>
       </w:r>
-      <w:bookmarkEnd w:id="21"/>
+      <w:bookmarkEnd w:id="19"/>
       <w:r>
         <w:rPr/>
         <w:t xml:space="preserve"> </w:t>
@@ -3209,12 +3181,12 @@
         <w:ind w:hanging="720" w:left="720"/>
         <w:rPr/>
       </w:pPr>
-      <w:bookmarkStart w:id="22" w:name="_Toc226825442"/>
+      <w:bookmarkStart w:id="20" w:name="_Toc226825442"/>
       <w:r>
         <w:rPr/>
         <w:t>Logical View</w:t>
       </w:r>
-      <w:bookmarkEnd w:id="22"/>
+      <w:bookmarkEnd w:id="20"/>
       <w:r>
         <w:rPr/>
         <w:t xml:space="preserve"> </w:t>
@@ -3226,12 +3198,12 @@
         <w:ind w:hanging="720" w:left="720"/>
         <w:rPr/>
       </w:pPr>
-      <w:bookmarkStart w:id="23" w:name="_Toc226825443"/>
+      <w:bookmarkStart w:id="21" w:name="_Toc226825443"/>
       <w:r>
         <w:rPr/>
         <w:t>Overview</w:t>
       </w:r>
-      <w:bookmarkEnd w:id="23"/>
+      <w:bookmarkEnd w:id="21"/>
     </w:p>
     <w:p>
       <w:pPr>
@@ -3635,88 +3607,60 @@
       </w:pPr>
       <w:r>
         <w:rPr/>
-        <mc:AlternateContent>
-          <mc:Choice Requires="wps">
-            <w:drawing>
-              <wp:anchor behindDoc="1" distT="0" distB="0" distL="0" distR="0" simplePos="0" locked="0" layoutInCell="0" allowOverlap="1" relativeHeight="7">
-                <wp:simplePos x="0" y="0"/>
-                <wp:positionH relativeFrom="column">
-                  <wp:posOffset>211455</wp:posOffset>
-                </wp:positionH>
-                <wp:positionV relativeFrom="paragraph">
-                  <wp:posOffset>78740</wp:posOffset>
-                </wp:positionV>
-                <wp:extent cx="4074160" cy="3398520"/>
-                <wp:effectExtent l="0" t="0" r="0" b="0"/>
-                <wp:wrapThrough wrapText="bothSides">
-                  <wp:wrapPolygon edited="0">
-                    <wp:start x="0" y="0"/>
-                    <wp:lineTo x="21600" y="0"/>
-                    <wp:lineTo x="21600" y="21600"/>
-                    <wp:lineTo x="0" y="21600"/>
-                    <wp:lineTo x="0" y="0"/>
-                  </wp:wrapPolygon>
-                </wp:wrapThrough>
-                <wp:docPr id="2" name=""/>
-                <a:graphic xmlns:a="http://schemas.openxmlformats.org/drawingml/2006/main">
-                  <a:graphicData uri="http://schemas.openxmlformats.org/drawingml/2006/picture">
-                    <pic:pic xmlns:pic="http://schemas.openxmlformats.org/drawingml/2006/picture">
-                      <pic:nvPicPr>
-                        <pic:cNvPr id="3" name=""/>
-                        <pic:cNvPicPr/>
-                      </pic:nvPicPr>
-                      <pic:blipFill>
-                        <a:blip r:embed="rId14"/>
-                        <a:stretch/>
-                      </pic:blipFill>
-                      <pic:spPr>
-                        <a:xfrm>
-                          <a:off x="0" y="0"/>
-                          <a:ext cx="4074120" cy="3398400"/>
-                        </a:xfrm>
-                        <a:prstGeom prst="rect">
-                          <a:avLst/>
-                        </a:prstGeom>
-                        <a:noFill/>
-                        <a:ln w="0">
-                          <a:noFill/>
-                        </a:ln>
-                      </pic:spPr>
-                    </pic:pic>
-                  </a:graphicData>
-                </a:graphic>
-              </wp:anchor>
-            </w:drawing>
-          </mc:Choice>
-          <mc:Fallback>
-            <w:pict>
-              <v:shapetype id="_x0000_t75" coordsize="21600,21600" o:spt="75" o:preferrelative="t" path="m@4@5l@4@11@9@11@9@5xe" filled="f" stroked="f">
-                <v:stroke joinstyle="miter"/>
-                <v:formulas>
-                  <v:f eqn="if lineDrawn pixelLineWidth 0"/>
-                  <v:f eqn="sum @0 1 0"/>
-                  <v:f eqn="sum 0 0 @1"/>
-                  <v:f eqn="prod @2 1 2"/>
-                  <v:f eqn="prod @3 21600 pixelWidth"/>
-                  <v:f eqn="prod @3 21600 pixelHeight"/>
-                  <v:f eqn="sum @0 0 1"/>
-                  <v:f eqn="prod @6 1 2"/>
-                  <v:f eqn="prod @7 21600 pixelWidth"/>
-                  <v:f eqn="sum @8 21600 0"/>
-                  <v:f eqn="prod @7 21600 pixelHeight"/>
-                  <v:f eqn="sum @10 21600 0"/>
-                </v:formulas>
-                <v:path o:extrusionok="f" gradientshapeok="t" o:connecttype="rect"/>
-                <o:lock v:ext="edit" aspectratio="t"/>
-              </v:shapetype>
-              <v:shape id="shape_0" stroked="f" o:allowincell="f" style="position:absolute;margin-left:16.65pt;margin-top:6.2pt;width:320.75pt;height:267.55pt;mso-wrap-style:none;v-text-anchor:middle" type="_x0000_t75">
-                <v:imagedata r:id="rId15" o:detectmouseclick="t"/>
-                <v:stroke color="#3465a4" joinstyle="round" endcap="flat"/>
-                <w10:wrap type="square"/>
-              </v:shape>
-            </w:pict>
-          </mc:Fallback>
-        </mc:AlternateContent>
+        <w:drawing>
+          <wp:anchor behindDoc="0" distT="0" distB="0" distL="0" distR="0" simplePos="0" locked="0" layoutInCell="0" allowOverlap="1" relativeHeight="8">
+            <wp:simplePos x="0" y="0"/>
+            <wp:positionH relativeFrom="column">
+              <wp:posOffset>211455</wp:posOffset>
+            </wp:positionH>
+            <wp:positionV relativeFrom="paragraph">
+              <wp:posOffset>78740</wp:posOffset>
+            </wp:positionV>
+            <wp:extent cx="4074160" cy="3398520"/>
+            <wp:effectExtent l="0" t="0" r="0" b="0"/>
+            <wp:wrapThrough wrapText="bothSides">
+              <wp:wrapPolygon edited="0">
+                <wp:start x="0" y="0"/>
+                <wp:lineTo x="21599" y="0"/>
+                <wp:lineTo x="21599" y="21599"/>
+                <wp:lineTo x="0" y="21599"/>
+                <wp:lineTo x="0" y="0"/>
+              </wp:wrapPolygon>
+            </wp:wrapThrough>
+            <wp:docPr id="2" name="Image1"/>
+            <wp:cNvGraphicFramePr>
+              <a:graphicFrameLocks xmlns:a="http://schemas.openxmlformats.org/drawingml/2006/main" noChangeAspect="1"/>
+            </wp:cNvGraphicFramePr>
+            <a:graphic xmlns:a="http://schemas.openxmlformats.org/drawingml/2006/main">
+              <a:graphicData uri="http://schemas.openxmlformats.org/drawingml/2006/picture">
+                <pic:pic xmlns:pic="http://schemas.openxmlformats.org/drawingml/2006/picture">
+                  <pic:nvPicPr>
+                    <pic:cNvPr id="2" name="Image1"/>
+                    <pic:cNvPicPr>
+                      <a:picLocks noChangeAspect="1" noChangeArrowheads="1"/>
+                    </pic:cNvPicPr>
+                  </pic:nvPicPr>
+                  <pic:blipFill>
+                    <a:blip r:embed="rId14"/>
+                    <a:stretch>
+                      <a:fillRect/>
+                    </a:stretch>
+                  </pic:blipFill>
+                  <pic:spPr bwMode="auto">
+                    <a:xfrm>
+                      <a:off x="0" y="0"/>
+                      <a:ext cx="4074160" cy="3398520"/>
+                    </a:xfrm>
+                    <a:prstGeom prst="rect">
+                      <a:avLst/>
+                    </a:prstGeom>
+                    <a:noFill/>
+                  </pic:spPr>
+                </pic:pic>
+              </a:graphicData>
+            </a:graphic>
+          </wp:anchor>
+        </w:drawing>
       </w:r>
     </w:p>
     <w:p>
@@ -3844,12 +3788,12 @@
         <w:ind w:hanging="720" w:left="720"/>
         <w:rPr/>
       </w:pPr>
-      <w:bookmarkStart w:id="24" w:name="_Toc226825444"/>
+      <w:bookmarkStart w:id="22" w:name="_Toc226825444"/>
       <w:r>
         <w:rPr/>
         <w:t>Architecturally Significant Design Modules or Packages</w:t>
       </w:r>
-      <w:bookmarkEnd w:id="24"/>
+      <w:bookmarkEnd w:id="22"/>
     </w:p>
     <w:p>
       <w:pPr>
@@ -3857,12 +3801,12 @@
         <w:ind w:hanging="720" w:left="720"/>
         <w:rPr/>
       </w:pPr>
-      <w:bookmarkStart w:id="25" w:name="_Toc226825445"/>
+      <w:bookmarkStart w:id="23" w:name="_Toc226825445"/>
       <w:r>
         <w:rPr/>
         <w:t>User Interface (I/O) Package</w:t>
       </w:r>
-      <w:bookmarkEnd w:id="25"/>
+      <w:bookmarkEnd w:id="23"/>
     </w:p>
     <w:p>
       <w:pPr>
@@ -3977,69 +3921,60 @@
         </w:rPr>
       </w:pPr>
       <w:r>
-        <mc:AlternateContent>
-          <mc:Choice Requires="wps">
-            <w:drawing>
-              <wp:anchor behindDoc="1" distT="0" distB="0" distL="0" distR="0" simplePos="0" locked="0" layoutInCell="0" allowOverlap="1" relativeHeight="5">
-                <wp:simplePos x="0" y="0"/>
-                <wp:positionH relativeFrom="column">
-                  <wp:posOffset>192405</wp:posOffset>
-                </wp:positionH>
-                <wp:positionV relativeFrom="paragraph">
-                  <wp:posOffset>518160</wp:posOffset>
-                </wp:positionV>
-                <wp:extent cx="3154680" cy="1104900"/>
-                <wp:effectExtent l="0" t="0" r="0" b="0"/>
-                <wp:wrapThrough wrapText="bothSides">
-                  <wp:wrapPolygon edited="0">
-                    <wp:start x="0" y="0"/>
-                    <wp:lineTo x="21600" y="0"/>
-                    <wp:lineTo x="21600" y="21600"/>
-                    <wp:lineTo x="0" y="21600"/>
-                    <wp:lineTo x="0" y="0"/>
-                  </wp:wrapPolygon>
-                </wp:wrapThrough>
-                <wp:docPr id="4" name="Picture 1"/>
-                <a:graphic xmlns:a="http://schemas.openxmlformats.org/drawingml/2006/main">
-                  <a:graphicData uri="http://schemas.openxmlformats.org/drawingml/2006/picture">
-                    <pic:pic xmlns:pic="http://schemas.openxmlformats.org/drawingml/2006/picture">
-                      <pic:nvPicPr>
-                        <pic:cNvPr id="5" name="Picture 1"/>
-                        <pic:cNvPicPr/>
-                      </pic:nvPicPr>
-                      <pic:blipFill>
-                        <a:blip r:embed="rId16"/>
-                        <a:stretch/>
-                      </pic:blipFill>
-                      <pic:spPr>
-                        <a:xfrm>
-                          <a:off x="0" y="0"/>
-                          <a:ext cx="3154680" cy="1104840"/>
-                        </a:xfrm>
-                        <a:prstGeom prst="rect">
-                          <a:avLst/>
-                        </a:prstGeom>
-                        <a:noFill/>
-                        <a:ln w="0">
-                          <a:noFill/>
-                        </a:ln>
-                      </pic:spPr>
-                    </pic:pic>
-                  </a:graphicData>
-                </a:graphic>
-              </wp:anchor>
-            </w:drawing>
-          </mc:Choice>
-          <mc:Fallback>
-            <w:pict>
-              <v:shape id="shape_0" stroked="f" o:allowincell="f" style="position:absolute;margin-left:15.15pt;margin-top:40.8pt;width:248.35pt;height:86.95pt;mso-wrap-style:none;v-text-anchor:middle" type="_x0000_t75">
-                <v:imagedata r:id="rId17" o:detectmouseclick="t"/>
-                <v:stroke color="#3465a4" joinstyle="round" endcap="flat"/>
-                <w10:wrap type="square"/>
-              </v:shape>
-            </w:pict>
-          </mc:Fallback>
-        </mc:AlternateContent>
+        <w:drawing>
+          <wp:anchor behindDoc="0" distT="0" distB="0" distL="0" distR="0" simplePos="0" locked="0" layoutInCell="0" allowOverlap="1" relativeHeight="6">
+            <wp:simplePos x="0" y="0"/>
+            <wp:positionH relativeFrom="column">
+              <wp:posOffset>192405</wp:posOffset>
+            </wp:positionH>
+            <wp:positionV relativeFrom="paragraph">
+              <wp:posOffset>518160</wp:posOffset>
+            </wp:positionV>
+            <wp:extent cx="3154680" cy="1104900"/>
+            <wp:effectExtent l="0" t="0" r="0" b="0"/>
+            <wp:wrapThrough wrapText="bothSides">
+              <wp:wrapPolygon edited="0">
+                <wp:start x="-1" y="0"/>
+                <wp:lineTo x="21600" y="0"/>
+                <wp:lineTo x="21600" y="21597"/>
+                <wp:lineTo x="-1" y="21597"/>
+                <wp:lineTo x="-1" y="0"/>
+              </wp:wrapPolygon>
+            </wp:wrapThrough>
+            <wp:docPr id="3" name="Picture 1"/>
+            <wp:cNvGraphicFramePr>
+              <a:graphicFrameLocks xmlns:a="http://schemas.openxmlformats.org/drawingml/2006/main" noChangeAspect="1"/>
+            </wp:cNvGraphicFramePr>
+            <a:graphic xmlns:a="http://schemas.openxmlformats.org/drawingml/2006/main">
+              <a:graphicData uri="http://schemas.openxmlformats.org/drawingml/2006/picture">
+                <pic:pic xmlns:pic="http://schemas.openxmlformats.org/drawingml/2006/picture">
+                  <pic:nvPicPr>
+                    <pic:cNvPr id="3" name="Picture 1"/>
+                    <pic:cNvPicPr>
+                      <a:picLocks noChangeAspect="1" noChangeArrowheads="1"/>
+                    </pic:cNvPicPr>
+                  </pic:nvPicPr>
+                  <pic:blipFill>
+                    <a:blip r:embed="rId15"/>
+                    <a:stretch>
+                      <a:fillRect/>
+                    </a:stretch>
+                  </pic:blipFill>
+                  <pic:spPr bwMode="auto">
+                    <a:xfrm>
+                      <a:off x="0" y="0"/>
+                      <a:ext cx="3154680" cy="1104900"/>
+                    </a:xfrm>
+                    <a:prstGeom prst="rect">
+                      <a:avLst/>
+                    </a:prstGeom>
+                    <a:noFill/>
+                  </pic:spPr>
+                </pic:pic>
+              </a:graphicData>
+            </a:graphic>
+          </wp:anchor>
+        </w:drawing>
       </w:r>
       <w:r>
         <w:rPr>
@@ -4114,12 +4049,12 @@
         <w:ind w:hanging="720" w:left="720"/>
         <w:rPr/>
       </w:pPr>
-      <w:bookmarkStart w:id="26" w:name="_Toc226825446"/>
+      <w:bookmarkStart w:id="24" w:name="_Toc226825446"/>
       <w:r>
         <w:rPr/>
         <w:t>Tokenizer Package</w:t>
       </w:r>
-      <w:bookmarkEnd w:id="26"/>
+      <w:bookmarkEnd w:id="24"/>
     </w:p>
     <w:p>
       <w:pPr>
@@ -4235,69 +4170,60 @@
       </w:pPr>
       <w:r>
         <w:rPr/>
-        <mc:AlternateContent>
-          <mc:Choice Requires="wps">
-            <w:drawing>
-              <wp:anchor behindDoc="1" distT="0" distB="0" distL="0" distR="0" simplePos="0" locked="0" layoutInCell="0" allowOverlap="1" relativeHeight="6">
-                <wp:simplePos x="0" y="0"/>
-                <wp:positionH relativeFrom="column">
-                  <wp:posOffset>340360</wp:posOffset>
-                </wp:positionH>
-                <wp:positionV relativeFrom="paragraph">
-                  <wp:posOffset>34925</wp:posOffset>
-                </wp:positionV>
-                <wp:extent cx="2705100" cy="1246505"/>
-                <wp:effectExtent l="0" t="0" r="0" b="0"/>
-                <wp:wrapThrough wrapText="bothSides">
-                  <wp:wrapPolygon edited="0">
-                    <wp:start x="0" y="0"/>
-                    <wp:lineTo x="21600" y="0"/>
-                    <wp:lineTo x="21600" y="21600"/>
-                    <wp:lineTo x="0" y="21600"/>
-                    <wp:lineTo x="0" y="0"/>
-                  </wp:wrapPolygon>
-                </wp:wrapThrough>
-                <wp:docPr id="6" name=""/>
-                <a:graphic xmlns:a="http://schemas.openxmlformats.org/drawingml/2006/main">
-                  <a:graphicData uri="http://schemas.openxmlformats.org/drawingml/2006/picture">
-                    <pic:pic xmlns:pic="http://schemas.openxmlformats.org/drawingml/2006/picture">
-                      <pic:nvPicPr>
-                        <pic:cNvPr id="7" name=""/>
-                        <pic:cNvPicPr/>
-                      </pic:nvPicPr>
-                      <pic:blipFill>
-                        <a:blip r:embed="rId18"/>
-                        <a:stretch/>
-                      </pic:blipFill>
-                      <pic:spPr>
-                        <a:xfrm>
-                          <a:off x="0" y="0"/>
-                          <a:ext cx="2705040" cy="1246680"/>
-                        </a:xfrm>
-                        <a:prstGeom prst="rect">
-                          <a:avLst/>
-                        </a:prstGeom>
-                        <a:noFill/>
-                        <a:ln w="0">
-                          <a:noFill/>
-                        </a:ln>
-                      </pic:spPr>
-                    </pic:pic>
-                  </a:graphicData>
-                </a:graphic>
-              </wp:anchor>
-            </w:drawing>
-          </mc:Choice>
-          <mc:Fallback>
-            <w:pict>
-              <v:shape id="shape_0" stroked="f" o:allowincell="f" style="position:absolute;margin-left:26.8pt;margin-top:2.75pt;width:212.95pt;height:98.1pt;mso-wrap-style:none;v-text-anchor:middle" type="_x0000_t75">
-                <v:imagedata r:id="rId19" o:detectmouseclick="t"/>
-                <v:stroke color="#3465a4" joinstyle="round" endcap="flat"/>
-                <w10:wrap type="square"/>
-              </v:shape>
-            </w:pict>
-          </mc:Fallback>
-        </mc:AlternateContent>
+        <w:drawing>
+          <wp:anchor behindDoc="0" distT="0" distB="0" distL="0" distR="0" simplePos="0" locked="0" layoutInCell="0" allowOverlap="1" relativeHeight="7">
+            <wp:simplePos x="0" y="0"/>
+            <wp:positionH relativeFrom="column">
+              <wp:posOffset>340360</wp:posOffset>
+            </wp:positionH>
+            <wp:positionV relativeFrom="paragraph">
+              <wp:posOffset>34925</wp:posOffset>
+            </wp:positionV>
+            <wp:extent cx="2705100" cy="1246505"/>
+            <wp:effectExtent l="0" t="0" r="0" b="0"/>
+            <wp:wrapThrough wrapText="bothSides">
+              <wp:wrapPolygon edited="0">
+                <wp:start x="-1" y="0"/>
+                <wp:lineTo x="21600" y="0"/>
+                <wp:lineTo x="21600" y="21598"/>
+                <wp:lineTo x="-1" y="21598"/>
+                <wp:lineTo x="-1" y="0"/>
+              </wp:wrapPolygon>
+            </wp:wrapThrough>
+            <wp:docPr id="4" name="Image2"/>
+            <wp:cNvGraphicFramePr>
+              <a:graphicFrameLocks xmlns:a="http://schemas.openxmlformats.org/drawingml/2006/main" noChangeAspect="1"/>
+            </wp:cNvGraphicFramePr>
+            <a:graphic xmlns:a="http://schemas.openxmlformats.org/drawingml/2006/main">
+              <a:graphicData uri="http://schemas.openxmlformats.org/drawingml/2006/picture">
+                <pic:pic xmlns:pic="http://schemas.openxmlformats.org/drawingml/2006/picture">
+                  <pic:nvPicPr>
+                    <pic:cNvPr id="4" name="Image2"/>
+                    <pic:cNvPicPr>
+                      <a:picLocks noChangeAspect="1" noChangeArrowheads="1"/>
+                    </pic:cNvPicPr>
+                  </pic:nvPicPr>
+                  <pic:blipFill>
+                    <a:blip r:embed="rId16"/>
+                    <a:stretch>
+                      <a:fillRect/>
+                    </a:stretch>
+                  </pic:blipFill>
+                  <pic:spPr bwMode="auto">
+                    <a:xfrm>
+                      <a:off x="0" y="0"/>
+                      <a:ext cx="2705100" cy="1246505"/>
+                    </a:xfrm>
+                    <a:prstGeom prst="rect">
+                      <a:avLst/>
+                    </a:prstGeom>
+                    <a:noFill/>
+                  </pic:spPr>
+                </pic:pic>
+              </a:graphicData>
+            </a:graphic>
+          </wp:anchor>
+        </w:drawing>
       </w:r>
     </w:p>
     <w:p>
@@ -4367,12 +4293,12 @@
         <w:ind w:hanging="720" w:left="720"/>
         <w:rPr/>
       </w:pPr>
-      <w:bookmarkStart w:id="27" w:name="_Toc226825447"/>
+      <w:bookmarkStart w:id="25" w:name="_Toc226825447"/>
       <w:r>
         <w:rPr/>
         <w:t>Parser Package</w:t>
       </w:r>
-      <w:bookmarkEnd w:id="27"/>
+      <w:bookmarkEnd w:id="25"/>
     </w:p>
     <w:p>
       <w:pPr>
@@ -4448,70 +4374,61 @@
         <w:rPr/>
       </w:pPr>
       <w:r>
-        <mc:AlternateContent>
-          <mc:Choice Requires="wps">
-            <w:drawing>
-              <wp:anchor behindDoc="1" distT="0" distB="0" distL="0" distR="0" simplePos="0" locked="0" layoutInCell="0" allowOverlap="1" relativeHeight="2">
-                <wp:simplePos x="0" y="0"/>
-                <wp:positionH relativeFrom="column">
-                  <wp:posOffset>335915</wp:posOffset>
-                </wp:positionH>
-                <wp:positionV relativeFrom="paragraph">
-                  <wp:posOffset>472440</wp:posOffset>
-                </wp:positionV>
-                <wp:extent cx="1722120" cy="1085215"/>
-                <wp:effectExtent l="0" t="0" r="0" b="0"/>
-                <wp:wrapThrough wrapText="bothSides">
-                  <wp:wrapPolygon edited="0">
-                    <wp:start x="0" y="0"/>
-                    <wp:lineTo x="21600" y="0"/>
-                    <wp:lineTo x="21600" y="21600"/>
-                    <wp:lineTo x="0" y="21600"/>
-                    <wp:lineTo x="0" y="0"/>
-                  </wp:wrapPolygon>
-                </wp:wrapThrough>
-                <wp:docPr id="8" name=""/>
-                <a:graphic xmlns:a="http://schemas.openxmlformats.org/drawingml/2006/main">
-                  <a:graphicData uri="http://schemas.openxmlformats.org/drawingml/2006/picture">
-                    <pic:pic xmlns:pic="http://schemas.openxmlformats.org/drawingml/2006/picture">
-                      <pic:nvPicPr>
-                        <pic:cNvPr id="9" name=""/>
-                        <pic:cNvPicPr/>
-                      </pic:nvPicPr>
-                      <pic:blipFill>
-                        <a:blip r:embed="rId20"/>
-                        <a:srcRect l="0" t="0" r="0" b="7761"/>
-                        <a:stretch/>
-                      </pic:blipFill>
-                      <pic:spPr>
-                        <a:xfrm>
-                          <a:off x="0" y="0"/>
-                          <a:ext cx="1722240" cy="1085040"/>
-                        </a:xfrm>
-                        <a:prstGeom prst="rect">
-                          <a:avLst/>
-                        </a:prstGeom>
-                        <a:noFill/>
-                        <a:ln w="0">
-                          <a:noFill/>
-                        </a:ln>
-                      </pic:spPr>
-                    </pic:pic>
-                  </a:graphicData>
-                </a:graphic>
-              </wp:anchor>
-            </w:drawing>
-          </mc:Choice>
-          <mc:Fallback>
-            <w:pict>
-              <v:shape id="shape_0" stroked="f" o:allowincell="f" style="position:absolute;margin-left:26.45pt;margin-top:37.2pt;width:135.55pt;height:85.4pt;mso-wrap-style:none;v-text-anchor:middle" type="_x0000_t75">
-                <v:imagedata r:id="rId21" o:detectmouseclick="t"/>
-                <v:stroke color="#3465a4" joinstyle="round" endcap="flat"/>
-                <w10:wrap type="square"/>
-              </v:shape>
-            </w:pict>
-          </mc:Fallback>
-        </mc:AlternateContent>
+        <w:drawing>
+          <wp:anchor behindDoc="0" distT="0" distB="0" distL="0" distR="0" simplePos="0" locked="0" layoutInCell="0" allowOverlap="1" relativeHeight="3">
+            <wp:simplePos x="0" y="0"/>
+            <wp:positionH relativeFrom="column">
+              <wp:posOffset>335915</wp:posOffset>
+            </wp:positionH>
+            <wp:positionV relativeFrom="paragraph">
+              <wp:posOffset>472440</wp:posOffset>
+            </wp:positionV>
+            <wp:extent cx="1722120" cy="1085215"/>
+            <wp:effectExtent l="0" t="0" r="0" b="0"/>
+            <wp:wrapThrough wrapText="bothSides">
+              <wp:wrapPolygon edited="0">
+                <wp:start x="-2" y="0"/>
+                <wp:lineTo x="21600" y="0"/>
+                <wp:lineTo x="21600" y="21605"/>
+                <wp:lineTo x="-2" y="21605"/>
+                <wp:lineTo x="-2" y="0"/>
+              </wp:wrapPolygon>
+            </wp:wrapThrough>
+            <wp:docPr id="5" name="Image3"/>
+            <wp:cNvGraphicFramePr>
+              <a:graphicFrameLocks xmlns:a="http://schemas.openxmlformats.org/drawingml/2006/main" noChangeAspect="1"/>
+            </wp:cNvGraphicFramePr>
+            <a:graphic xmlns:a="http://schemas.openxmlformats.org/drawingml/2006/main">
+              <a:graphicData uri="http://schemas.openxmlformats.org/drawingml/2006/picture">
+                <pic:pic xmlns:pic="http://schemas.openxmlformats.org/drawingml/2006/picture">
+                  <pic:nvPicPr>
+                    <pic:cNvPr id="5" name="Image3"/>
+                    <pic:cNvPicPr>
+                      <a:picLocks noChangeAspect="1" noChangeArrowheads="1"/>
+                    </pic:cNvPicPr>
+                  </pic:nvPicPr>
+                  <pic:blipFill>
+                    <a:blip r:embed="rId17"/>
+                    <a:srcRect l="0" t="0" r="0" b="7790"/>
+                    <a:stretch>
+                      <a:fillRect/>
+                    </a:stretch>
+                  </pic:blipFill>
+                  <pic:spPr bwMode="auto">
+                    <a:xfrm>
+                      <a:off x="0" y="0"/>
+                      <a:ext cx="1722120" cy="1085215"/>
+                    </a:xfrm>
+                    <a:prstGeom prst="rect">
+                      <a:avLst/>
+                    </a:prstGeom>
+                    <a:noFill/>
+                  </pic:spPr>
+                </pic:pic>
+              </a:graphicData>
+            </a:graphic>
+          </wp:anchor>
+        </w:drawing>
       </w:r>
       <w:r>
         <w:rPr>
@@ -4602,12 +4519,12 @@
         <w:ind w:hanging="720" w:left="720"/>
         <w:rPr/>
       </w:pPr>
-      <w:bookmarkStart w:id="28" w:name="_Toc226825448"/>
+      <w:bookmarkStart w:id="26" w:name="_Toc226825448"/>
       <w:r>
         <w:rPr/>
         <w:t>Evaluator Package</w:t>
       </w:r>
-      <w:bookmarkEnd w:id="28"/>
+      <w:bookmarkEnd w:id="26"/>
     </w:p>
     <w:p>
       <w:pPr>
@@ -4701,69 +4618,60 @@
         <w:rPr/>
       </w:pPr>
       <w:r>
-        <mc:AlternateContent>
-          <mc:Choice Requires="wps">
-            <w:drawing>
-              <wp:anchor behindDoc="1" distT="0" distB="0" distL="0" distR="0" simplePos="0" locked="0" layoutInCell="0" allowOverlap="1" relativeHeight="3">
-                <wp:simplePos x="0" y="0"/>
-                <wp:positionH relativeFrom="column">
-                  <wp:posOffset>461010</wp:posOffset>
-                </wp:positionH>
-                <wp:positionV relativeFrom="paragraph">
-                  <wp:posOffset>93980</wp:posOffset>
-                </wp:positionV>
-                <wp:extent cx="1939290" cy="1223645"/>
-                <wp:effectExtent l="0" t="0" r="0" b="0"/>
-                <wp:wrapThrough wrapText="bothSides">
-                  <wp:wrapPolygon edited="0">
-                    <wp:start x="0" y="0"/>
-                    <wp:lineTo x="21600" y="0"/>
-                    <wp:lineTo x="21600" y="21600"/>
-                    <wp:lineTo x="0" y="21600"/>
-                    <wp:lineTo x="0" y="0"/>
-                  </wp:wrapPolygon>
-                </wp:wrapThrough>
-                <wp:docPr id="10" name=""/>
-                <a:graphic xmlns:a="http://schemas.openxmlformats.org/drawingml/2006/main">
-                  <a:graphicData uri="http://schemas.openxmlformats.org/drawingml/2006/picture">
-                    <pic:pic xmlns:pic="http://schemas.openxmlformats.org/drawingml/2006/picture">
-                      <pic:nvPicPr>
-                        <pic:cNvPr id="11" name=""/>
-                        <pic:cNvPicPr/>
-                      </pic:nvPicPr>
-                      <pic:blipFill>
-                        <a:blip r:embed="rId22"/>
-                        <a:stretch/>
-                      </pic:blipFill>
-                      <pic:spPr>
-                        <a:xfrm>
-                          <a:off x="0" y="0"/>
-                          <a:ext cx="1939320" cy="1223640"/>
-                        </a:xfrm>
-                        <a:prstGeom prst="rect">
-                          <a:avLst/>
-                        </a:prstGeom>
-                        <a:noFill/>
-                        <a:ln w="0">
-                          <a:noFill/>
-                        </a:ln>
-                      </pic:spPr>
-                    </pic:pic>
-                  </a:graphicData>
-                </a:graphic>
-              </wp:anchor>
-            </w:drawing>
-          </mc:Choice>
-          <mc:Fallback>
-            <w:pict>
-              <v:shape id="shape_0" stroked="f" o:allowincell="f" style="position:absolute;margin-left:36.3pt;margin-top:7.4pt;width:152.65pt;height:96.3pt;mso-wrap-style:none;v-text-anchor:middle" type="_x0000_t75">
-                <v:imagedata r:id="rId23" o:detectmouseclick="t"/>
-                <v:stroke color="#3465a4" joinstyle="round" endcap="flat"/>
-                <w10:wrap type="square"/>
-              </v:shape>
-            </w:pict>
-          </mc:Fallback>
-        </mc:AlternateContent>
+        <w:drawing>
+          <wp:anchor behindDoc="0" distT="0" distB="0" distL="0" distR="0" simplePos="0" locked="0" layoutInCell="0" allowOverlap="1" relativeHeight="4">
+            <wp:simplePos x="0" y="0"/>
+            <wp:positionH relativeFrom="column">
+              <wp:posOffset>461010</wp:posOffset>
+            </wp:positionH>
+            <wp:positionV relativeFrom="paragraph">
+              <wp:posOffset>93980</wp:posOffset>
+            </wp:positionV>
+            <wp:extent cx="1939290" cy="1223645"/>
+            <wp:effectExtent l="0" t="0" r="0" b="0"/>
+            <wp:wrapThrough wrapText="bothSides">
+              <wp:wrapPolygon edited="0">
+                <wp:start x="-2" y="0"/>
+                <wp:lineTo x="21600" y="0"/>
+                <wp:lineTo x="21600" y="21601"/>
+                <wp:lineTo x="-2" y="21601"/>
+                <wp:lineTo x="-2" y="0"/>
+              </wp:wrapPolygon>
+            </wp:wrapThrough>
+            <wp:docPr id="6" name="Image4"/>
+            <wp:cNvGraphicFramePr>
+              <a:graphicFrameLocks xmlns:a="http://schemas.openxmlformats.org/drawingml/2006/main" noChangeAspect="1"/>
+            </wp:cNvGraphicFramePr>
+            <a:graphic xmlns:a="http://schemas.openxmlformats.org/drawingml/2006/main">
+              <a:graphicData uri="http://schemas.openxmlformats.org/drawingml/2006/picture">
+                <pic:pic xmlns:pic="http://schemas.openxmlformats.org/drawingml/2006/picture">
+                  <pic:nvPicPr>
+                    <pic:cNvPr id="6" name="Image4"/>
+                    <pic:cNvPicPr>
+                      <a:picLocks noChangeAspect="1" noChangeArrowheads="1"/>
+                    </pic:cNvPicPr>
+                  </pic:nvPicPr>
+                  <pic:blipFill>
+                    <a:blip r:embed="rId18"/>
+                    <a:stretch>
+                      <a:fillRect/>
+                    </a:stretch>
+                  </pic:blipFill>
+                  <pic:spPr bwMode="auto">
+                    <a:xfrm>
+                      <a:off x="0" y="0"/>
+                      <a:ext cx="1939290" cy="1223645"/>
+                    </a:xfrm>
+                    <a:prstGeom prst="rect">
+                      <a:avLst/>
+                    </a:prstGeom>
+                    <a:noFill/>
+                  </pic:spPr>
+                </pic:pic>
+              </a:graphicData>
+            </a:graphic>
+          </wp:anchor>
+        </w:drawing>
       </w:r>
       <w:r>
         <w:rPr/>
@@ -4847,12 +4755,12 @@
         <w:ind w:hanging="720" w:left="720"/>
         <w:rPr/>
       </w:pPr>
-      <w:bookmarkStart w:id="29" w:name="_Toc226825449"/>
+      <w:bookmarkStart w:id="27" w:name="_Toc226825449"/>
       <w:r>
         <w:rPr/>
         <w:t>Error Handler Package</w:t>
       </w:r>
-      <w:bookmarkEnd w:id="29"/>
+      <w:bookmarkEnd w:id="27"/>
     </w:p>
     <w:p>
       <w:pPr>
@@ -4948,69 +4856,60 @@
       </w:pPr>
       <w:r>
         <w:rPr/>
-        <mc:AlternateContent>
-          <mc:Choice Requires="wps">
-            <w:drawing>
-              <wp:anchor behindDoc="1" distT="0" distB="0" distL="0" distR="0" simplePos="0" locked="0" layoutInCell="0" allowOverlap="1" relativeHeight="4">
-                <wp:simplePos x="0" y="0"/>
-                <wp:positionH relativeFrom="column">
-                  <wp:posOffset>414655</wp:posOffset>
-                </wp:positionH>
-                <wp:positionV relativeFrom="paragraph">
-                  <wp:posOffset>64135</wp:posOffset>
-                </wp:positionV>
-                <wp:extent cx="1767840" cy="979170"/>
-                <wp:effectExtent l="0" t="0" r="0" b="0"/>
-                <wp:wrapThrough wrapText="bothSides">
-                  <wp:wrapPolygon edited="0">
-                    <wp:start x="0" y="0"/>
-                    <wp:lineTo x="21600" y="0"/>
-                    <wp:lineTo x="21600" y="21600"/>
-                    <wp:lineTo x="0" y="21600"/>
-                    <wp:lineTo x="0" y="0"/>
-                  </wp:wrapPolygon>
-                </wp:wrapThrough>
-                <wp:docPr id="12" name=""/>
-                <a:graphic xmlns:a="http://schemas.openxmlformats.org/drawingml/2006/main">
-                  <a:graphicData uri="http://schemas.openxmlformats.org/drawingml/2006/picture">
-                    <pic:pic xmlns:pic="http://schemas.openxmlformats.org/drawingml/2006/picture">
-                      <pic:nvPicPr>
-                        <pic:cNvPr id="13" name=""/>
-                        <pic:cNvPicPr/>
-                      </pic:nvPicPr>
-                      <pic:blipFill>
-                        <a:blip r:embed="rId24"/>
-                        <a:stretch/>
-                      </pic:blipFill>
-                      <pic:spPr>
-                        <a:xfrm>
-                          <a:off x="0" y="0"/>
-                          <a:ext cx="1767960" cy="979200"/>
-                        </a:xfrm>
-                        <a:prstGeom prst="rect">
-                          <a:avLst/>
-                        </a:prstGeom>
-                        <a:noFill/>
-                        <a:ln w="0">
-                          <a:noFill/>
-                        </a:ln>
-                      </pic:spPr>
-                    </pic:pic>
-                  </a:graphicData>
-                </a:graphic>
-              </wp:anchor>
-            </w:drawing>
-          </mc:Choice>
-          <mc:Fallback>
-            <w:pict>
-              <v:shape id="shape_0" stroked="f" o:allowincell="f" style="position:absolute;margin-left:32.65pt;margin-top:5.05pt;width:139.15pt;height:77.05pt;mso-wrap-style:none;v-text-anchor:middle" type="_x0000_t75">
-                <v:imagedata r:id="rId25" o:detectmouseclick="t"/>
-                <v:stroke color="#3465a4" joinstyle="round" endcap="flat"/>
-                <w10:wrap type="square"/>
-              </v:shape>
-            </w:pict>
-          </mc:Fallback>
-        </mc:AlternateContent>
+        <w:drawing>
+          <wp:anchor behindDoc="0" distT="0" distB="0" distL="0" distR="0" simplePos="0" locked="0" layoutInCell="0" allowOverlap="1" relativeHeight="5">
+            <wp:simplePos x="0" y="0"/>
+            <wp:positionH relativeFrom="column">
+              <wp:posOffset>414655</wp:posOffset>
+            </wp:positionH>
+            <wp:positionV relativeFrom="paragraph">
+              <wp:posOffset>64135</wp:posOffset>
+            </wp:positionV>
+            <wp:extent cx="1767840" cy="979170"/>
+            <wp:effectExtent l="0" t="0" r="0" b="0"/>
+            <wp:wrapThrough wrapText="bothSides">
+              <wp:wrapPolygon edited="0">
+                <wp:start x="-2" y="0"/>
+                <wp:lineTo x="21600" y="0"/>
+                <wp:lineTo x="21600" y="21601"/>
+                <wp:lineTo x="-2" y="21601"/>
+                <wp:lineTo x="-2" y="0"/>
+              </wp:wrapPolygon>
+            </wp:wrapThrough>
+            <wp:docPr id="7" name="Image5"/>
+            <wp:cNvGraphicFramePr>
+              <a:graphicFrameLocks xmlns:a="http://schemas.openxmlformats.org/drawingml/2006/main" noChangeAspect="1"/>
+            </wp:cNvGraphicFramePr>
+            <a:graphic xmlns:a="http://schemas.openxmlformats.org/drawingml/2006/main">
+              <a:graphicData uri="http://schemas.openxmlformats.org/drawingml/2006/picture">
+                <pic:pic xmlns:pic="http://schemas.openxmlformats.org/drawingml/2006/picture">
+                  <pic:nvPicPr>
+                    <pic:cNvPr id="7" name="Image5"/>
+                    <pic:cNvPicPr>
+                      <a:picLocks noChangeAspect="1" noChangeArrowheads="1"/>
+                    </pic:cNvPicPr>
+                  </pic:nvPicPr>
+                  <pic:blipFill>
+                    <a:blip r:embed="rId19"/>
+                    <a:stretch>
+                      <a:fillRect/>
+                    </a:stretch>
+                  </pic:blipFill>
+                  <pic:spPr bwMode="auto">
+                    <a:xfrm>
+                      <a:off x="0" y="0"/>
+                      <a:ext cx="1767840" cy="979170"/>
+                    </a:xfrm>
+                    <a:prstGeom prst="rect">
+                      <a:avLst/>
+                    </a:prstGeom>
+                    <a:noFill/>
+                  </pic:spPr>
+                </pic:pic>
+              </a:graphicData>
+            </a:graphic>
+          </wp:anchor>
+        </w:drawing>
       </w:r>
     </w:p>
     <w:p>
@@ -5070,12 +4969,12 @@
         <w:ind w:hanging="720" w:left="720"/>
         <w:rPr/>
       </w:pPr>
-      <w:bookmarkStart w:id="30" w:name="_Toc226825450"/>
+      <w:bookmarkStart w:id="28" w:name="_Toc226825450"/>
       <w:r>
         <w:rPr/>
         <w:t>Interface Description</w:t>
       </w:r>
-      <w:bookmarkEnd w:id="30"/>
+      <w:bookmarkEnd w:id="28"/>
     </w:p>
     <w:p>
       <w:pPr>
@@ -5113,12 +5012,12 @@
         <w:ind w:hanging="720" w:left="720"/>
         <w:rPr/>
       </w:pPr>
-      <w:bookmarkStart w:id="31" w:name="_Toc226825451"/>
+      <w:bookmarkStart w:id="29" w:name="_Toc226825451"/>
       <w:r>
         <w:rPr/>
         <w:t>Quality</w:t>
       </w:r>
-      <w:bookmarkEnd w:id="31"/>
+      <w:bookmarkEnd w:id="29"/>
       <w:r>
         <w:rPr/>
         <w:t xml:space="preserve"> </w:t>
@@ -5332,12 +5231,12 @@
       </w:r>
     </w:p>
     <w:sectPr>
-      <w:headerReference w:type="even" r:id="rId26"/>
-      <w:headerReference w:type="default" r:id="rId27"/>
-      <w:headerReference w:type="first" r:id="rId28"/>
-      <w:footerReference w:type="even" r:id="rId29"/>
-      <w:footerReference w:type="default" r:id="rId30"/>
-      <w:footerReference w:type="first" r:id="rId31"/>
+      <w:headerReference w:type="even" r:id="rId20"/>
+      <w:headerReference w:type="default" r:id="rId21"/>
+      <w:headerReference w:type="first" r:id="rId22"/>
+      <w:footerReference w:type="even" r:id="rId23"/>
+      <w:footerReference w:type="default" r:id="rId24"/>
+      <w:footerReference w:type="first" r:id="rId25"/>
       <w:type w:val="nextPage"/>
       <w:pgSz w:w="12240" w:h="15840"/>
       <w:pgMar w:left="1440" w:right="1440" w:gutter="0" w:header="720" w:top="1440" w:footer="720" w:bottom="1440"/>
@@ -5360,12 +5259,10 @@
     </w:pPr>
     <w:r>
       <w:rPr/>
-    </w:r>
-    <w:r>
       <mc:AlternateContent>
         <mc:Choice Requires="wps">
           <w:drawing>
-            <wp:anchor behindDoc="0" distT="0" distB="0" distL="0" distR="0" simplePos="0" locked="0" layoutInCell="1" allowOverlap="1" relativeHeight="0">
+            <wp:anchor behindDoc="1" distT="0" distB="0" distL="0" distR="0" simplePos="0" locked="0" layoutInCell="0" allowOverlap="1" relativeHeight="2">
               <wp:simplePos x="0" y="0"/>
               <wp:positionH relativeFrom="margin">
                 <wp:align>right</wp:align>
@@ -5380,25 +5277,31 @@
               <a:graphic xmlns:a="http://schemas.openxmlformats.org/drawingml/2006/main">
                 <a:graphicData uri="http://schemas.microsoft.com/office/word/2010/wordprocessingShape">
                   <wps:wsp>
-                    <wps:cNvSpPr txBox="1"/>
+                    <wps:cNvSpPr/>
                     <wps:spPr>
                       <a:xfrm>
                         <a:off x="0" y="0"/>
-                        <a:ext cx="14605" cy="14605"/>
+                        <a:ext cx="14760" cy="14760"/>
                       </a:xfrm>
-                      <a:prstGeom prst="rect"/>
-                      <a:solidFill>
-                        <a:srgbClr val="FFFFFF">
-                          <a:alpha val="0"/>
-                        </a:srgbClr>
-                      </a:solidFill>
+                      <a:prstGeom prst="rect">
+                        <a:avLst/>
+                      </a:prstGeom>
+                      <a:noFill/>
+                      <a:ln w="0">
+                        <a:noFill/>
+                      </a:ln>
                     </wps:spPr>
+                    <wps:style>
+                      <a:lnRef idx="0"/>
+                      <a:fillRef idx="0"/>
+                      <a:effectRef idx="0"/>
+                      <a:fontRef idx="minor"/>
+                    </wps:style>
                     <wps:txbx>
                       <w:txbxContent>
                         <w:p>
                           <w:pPr>
                             <w:pStyle w:val="Footer"/>
-                            <w:pBdr/>
                             <w:rPr>
                               <w:rStyle w:val="PageNumber"/>
                             </w:rPr>
@@ -5436,7 +5339,7 @@
                         </w:p>
                       </w:txbxContent>
                     </wps:txbx>
-                    <wps:bodyPr anchor="t" lIns="0" tIns="0" rIns="0" bIns="0">
+                    <wps:bodyPr lIns="0" tIns="0" rIns="0" bIns="0" anchor="t">
                       <a:spAutoFit/>
                     </wps:bodyPr>
                   </wps:wsp>
@@ -5447,14 +5350,14 @@
         </mc:Choice>
         <mc:Fallback>
           <w:pict>
-            <v:rect fillcolor="#FFFFFF" style="position:absolute;rotation:-0;width:1.15pt;height:1.15pt;mso-wrap-distance-left:0pt;mso-wrap-distance-right:0pt;mso-wrap-distance-top:0pt;mso-wrap-distance-bottom:0pt;margin-top:0.05pt;mso-position-vertical-relative:text;margin-left:0pt;mso-position-horizontal:right;mso-position-horizontal-relative:margin">
-              <v:fill opacity="0f"/>
-              <v:textbox inset="0in,0in,0in,0in">
+            <v:rect id="shape_0" fillcolor="white" stroked="f" o:allowincell="f" style="position:absolute;margin-left:0pt;margin-top:0.05pt;width:1.1pt;height:1.1pt;mso-wrap-style:square;v-text-anchor:top;mso-position-horizontal:right;mso-position-horizontal-relative:margin">
+              <v:fill o:detectmouseclick="t" type="solid" color2="black" opacity="0"/>
+              <v:stroke color="#3465a4" joinstyle="round" endcap="flat"/>
+              <v:textbox>
                 <w:txbxContent>
                   <w:p>
                     <w:pPr>
                       <w:pStyle w:val="Footer"/>
-                      <w:pBdr/>
                       <w:rPr>
                         <w:rStyle w:val="PageNumber"/>
                       </w:rPr>
@@ -6174,7 +6077,11 @@
           </w:r>
           <w:r>
             <w:rPr/>
-            <w:t>Version:           1.7</w:t>
+            <w:t>Version:           1.</w:t>
+          </w:r>
+          <w:r>
+            <w:rPr/>
+            <w:t>0</w:t>
           </w:r>
         </w:p>
       </w:tc>
@@ -6352,7 +6259,11 @@
           </w:r>
           <w:r>
             <w:rPr/>
-            <w:t>Version:           1.7</w:t>
+            <w:t>Version:           1.</w:t>
+          </w:r>
+          <w:r>
+            <w:rPr/>
+            <w:t>0</w:t>
           </w:r>
         </w:p>
       </w:tc>
@@ -7938,6 +7849,7 @@
     <w:qFormat/>
     <w:pPr>
       <w:widowControl w:val="false"/>
+      <w:suppressAutoHyphens w:val="true"/>
       <w:bidi w:val="0"/>
       <w:spacing w:lineRule="atLeast" w:line="240" w:before="0" w:after="0"/>
       <w:jc w:val="left"/>
@@ -8127,9 +8039,17 @@
     <w:basedOn w:val="DefaultParagraphFont"/>
     <w:rPr/>
   </w:style>
+  <w:style w:type="character" w:styleId="FootnoteCharactersuser">
+    <w:name w:val="Footnote Characters (user)"/>
+    <w:semiHidden/>
+    <w:qFormat/>
+    <w:rPr>
+      <w:sz w:val="20"/>
+      <w:vertAlign w:val="superscript"/>
+    </w:rPr>
+  </w:style>
   <w:style w:type="character" w:styleId="FootnoteCharacters">
     <w:name w:val="Footnote Characters"/>
-    <w:semiHidden/>
     <w:qFormat/>
     <w:rPr>
       <w:sz w:val="20"/>
@@ -8613,6 +8533,13 @@
       <w:szCs w:val="24"/>
     </w:rPr>
   </w:style>
+  <w:style w:type="paragraph" w:styleId="FrameContentsuser">
+    <w:name w:val="Frame Contents (user)"/>
+    <w:basedOn w:val="Normal"/>
+    <w:qFormat/>
+    <w:pPr/>
+    <w:rPr/>
+  </w:style>
   <w:style w:type="paragraph" w:styleId="FrameContents">
     <w:name w:val="Frame Contents"/>
     <w:basedOn w:val="Normal"/>

</xml_diff>

<commit_message>
missed one still, whoops
</commit_message>
<xml_diff>
--- a/documentation/editables/03-Software-Architecture-Design.docx
+++ b/documentation/editables/03-Software-Architecture-Design.docx
@@ -62,22 +62,7 @@
         <w:rPr>
           <w:sz w:val="28"/>
         </w:rPr>
-        <w:t>Version 1.</w:t>
-      </w:r>
-      <w:r>
-        <w:rPr>
-          <w:sz w:val="28"/>
-        </w:rPr>
-        <w:t>0</w:t>
-      </w:r>
-    </w:p>
-    <w:p>
-      <w:pPr>
-        <w:pStyle w:val="InfoBlue"/>
-        <w:rPr/>
-      </w:pPr>
-      <w:r>
-        <w:rPr/>
+        <w:t>Version 1.0</w:t>
       </w:r>
     </w:p>
     <w:p>
@@ -131,16 +116,16 @@
         <w:tblLook w:firstRow="0" w:noVBand="0" w:lastRow="0" w:firstColumn="0" w:lastColumn="0" w:noHBand="0" w:val="0000"/>
       </w:tblPr>
       <w:tblGrid>
-        <w:gridCol w:w="2302"/>
+        <w:gridCol w:w="2301"/>
         <w:gridCol w:w="1152"/>
-        <w:gridCol w:w="3746"/>
+        <w:gridCol w:w="3747"/>
         <w:gridCol w:w="2304"/>
       </w:tblGrid>
       <w:tr>
         <w:trPr/>
         <w:tc>
           <w:tcPr>
-            <w:tcW w:w="2302" w:type="dxa"/>
+            <w:tcW w:w="2301" w:type="dxa"/>
             <w:tcBorders>
               <w:top w:val="single" w:sz="6" w:space="0" w:color="000000"/>
               <w:left w:val="single" w:sz="6" w:space="0" w:color="000000"/>
@@ -194,7 +179,7 @@
         </w:tc>
         <w:tc>
           <w:tcPr>
-            <w:tcW w:w="3746" w:type="dxa"/>
+            <w:tcW w:w="3747" w:type="dxa"/>
             <w:tcBorders>
               <w:top w:val="single" w:sz="6" w:space="0" w:color="000000"/>
               <w:left w:val="single" w:sz="6" w:space="0" w:color="000000"/>
@@ -251,7 +236,7 @@
         <w:trPr/>
         <w:tc>
           <w:tcPr>
-            <w:tcW w:w="2302" w:type="dxa"/>
+            <w:tcW w:w="2301" w:type="dxa"/>
             <w:tcBorders>
               <w:top w:val="single" w:sz="6" w:space="0" w:color="000000"/>
               <w:left w:val="single" w:sz="6" w:space="0" w:color="000000"/>
@@ -297,7 +282,7 @@
         </w:tc>
         <w:tc>
           <w:tcPr>
-            <w:tcW w:w="3746" w:type="dxa"/>
+            <w:tcW w:w="3747" w:type="dxa"/>
             <w:tcBorders>
               <w:top w:val="single" w:sz="6" w:space="0" w:color="000000"/>
               <w:left w:val="single" w:sz="6" w:space="0" w:color="000000"/>
@@ -346,7 +331,7 @@
         <w:trPr/>
         <w:tc>
           <w:tcPr>
-            <w:tcW w:w="2302" w:type="dxa"/>
+            <w:tcW w:w="2301" w:type="dxa"/>
             <w:tcBorders>
               <w:top w:val="single" w:sz="6" w:space="0" w:color="000000"/>
               <w:left w:val="single" w:sz="6" w:space="0" w:color="000000"/>
@@ -392,7 +377,7 @@
         </w:tc>
         <w:tc>
           <w:tcPr>
-            <w:tcW w:w="3746" w:type="dxa"/>
+            <w:tcW w:w="3747" w:type="dxa"/>
             <w:tcBorders>
               <w:top w:val="single" w:sz="6" w:space="0" w:color="000000"/>
               <w:left w:val="single" w:sz="6" w:space="0" w:color="000000"/>
@@ -441,7 +426,7 @@
         <w:trPr/>
         <w:tc>
           <w:tcPr>
-            <w:tcW w:w="2302" w:type="dxa"/>
+            <w:tcW w:w="2301" w:type="dxa"/>
             <w:tcBorders>
               <w:top w:val="single" w:sz="6" w:space="0" w:color="000000"/>
               <w:left w:val="single" w:sz="6" w:space="0" w:color="000000"/>
@@ -487,7 +472,7 @@
         </w:tc>
         <w:tc>
           <w:tcPr>
-            <w:tcW w:w="3746" w:type="dxa"/>
+            <w:tcW w:w="3747" w:type="dxa"/>
             <w:tcBorders>
               <w:top w:val="single" w:sz="6" w:space="0" w:color="000000"/>
               <w:left w:val="single" w:sz="6" w:space="0" w:color="000000"/>
@@ -536,7 +521,7 @@
         <w:trPr/>
         <w:tc>
           <w:tcPr>
-            <w:tcW w:w="2302" w:type="dxa"/>
+            <w:tcW w:w="2301" w:type="dxa"/>
             <w:tcBorders>
               <w:top w:val="single" w:sz="6" w:space="0" w:color="000000"/>
               <w:left w:val="single" w:sz="6" w:space="0" w:color="000000"/>
@@ -582,7 +567,7 @@
         </w:tc>
         <w:tc>
           <w:tcPr>
-            <w:tcW w:w="3746" w:type="dxa"/>
+            <w:tcW w:w="3747" w:type="dxa"/>
             <w:tcBorders>
               <w:top w:val="single" w:sz="6" w:space="0" w:color="000000"/>
               <w:left w:val="single" w:sz="6" w:space="0" w:color="000000"/>
@@ -631,7 +616,7 @@
         <w:trPr/>
         <w:tc>
           <w:tcPr>
-            <w:tcW w:w="2302" w:type="dxa"/>
+            <w:tcW w:w="2301" w:type="dxa"/>
             <w:tcBorders>
               <w:top w:val="single" w:sz="6" w:space="0" w:color="000000"/>
               <w:left w:val="single" w:sz="6" w:space="0" w:color="000000"/>
@@ -677,7 +662,7 @@
         </w:tc>
         <w:tc>
           <w:tcPr>
-            <w:tcW w:w="3746" w:type="dxa"/>
+            <w:tcW w:w="3747" w:type="dxa"/>
             <w:tcBorders>
               <w:top w:val="single" w:sz="6" w:space="0" w:color="000000"/>
               <w:left w:val="single" w:sz="6" w:space="0" w:color="000000"/>
@@ -726,7 +711,7 @@
         <w:trPr/>
         <w:tc>
           <w:tcPr>
-            <w:tcW w:w="2302" w:type="dxa"/>
+            <w:tcW w:w="2301" w:type="dxa"/>
             <w:tcBorders>
               <w:top w:val="single" w:sz="6" w:space="0" w:color="000000"/>
               <w:left w:val="single" w:sz="6" w:space="0" w:color="000000"/>
@@ -772,7 +757,7 @@
         </w:tc>
         <w:tc>
           <w:tcPr>
-            <w:tcW w:w="3746" w:type="dxa"/>
+            <w:tcW w:w="3747" w:type="dxa"/>
             <w:tcBorders>
               <w:top w:val="single" w:sz="6" w:space="0" w:color="000000"/>
               <w:left w:val="single" w:sz="6" w:space="0" w:color="000000"/>
@@ -821,7 +806,7 @@
         <w:trPr/>
         <w:tc>
           <w:tcPr>
-            <w:tcW w:w="2302" w:type="dxa"/>
+            <w:tcW w:w="2301" w:type="dxa"/>
             <w:tcBorders>
               <w:top w:val="single" w:sz="6" w:space="0" w:color="000000"/>
               <w:left w:val="single" w:sz="6" w:space="0" w:color="000000"/>
@@ -867,7 +852,7 @@
         </w:tc>
         <w:tc>
           <w:tcPr>
-            <w:tcW w:w="3746" w:type="dxa"/>
+            <w:tcW w:w="3747" w:type="dxa"/>
             <w:tcBorders>
               <w:top w:val="single" w:sz="6" w:space="0" w:color="000000"/>
               <w:left w:val="single" w:sz="6" w:space="0" w:color="000000"/>
@@ -2036,8 +2021,8 @@
         <w:ind w:hanging="720" w:left="720"/>
         <w:rPr/>
       </w:pPr>
-      <w:bookmarkStart w:id="0" w:name="_Toc456598586"/>
-      <w:bookmarkStart w:id="1" w:name="_Toc226825428"/>
+      <w:bookmarkStart w:id="0" w:name="_Toc226825428"/>
+      <w:bookmarkStart w:id="1" w:name="_Toc456598586"/>
       <w:r>
         <w:rPr/>
         <w:t>Introduction</w:t>
@@ -2051,8 +2036,8 @@
         <w:ind w:hanging="720" w:left="720"/>
         <w:rPr/>
       </w:pPr>
-      <w:bookmarkStart w:id="2" w:name="_Toc456598587"/>
-      <w:bookmarkStart w:id="3" w:name="_Toc226825429"/>
+      <w:bookmarkStart w:id="2" w:name="_Toc226825429"/>
+      <w:bookmarkStart w:id="3" w:name="_Toc456598587"/>
       <w:r>
         <w:rPr/>
         <w:t>Purpose</w:t>
@@ -2102,8 +2087,8 @@
         <w:ind w:hanging="720" w:left="720"/>
         <w:rPr/>
       </w:pPr>
-      <w:bookmarkStart w:id="4" w:name="_Toc226825430"/>
-      <w:bookmarkStart w:id="5" w:name="_Toc456598588"/>
+      <w:bookmarkStart w:id="4" w:name="_Toc456598588"/>
+      <w:bookmarkStart w:id="5" w:name="_Toc226825430"/>
       <w:r>
         <w:rPr/>
         <w:t>Scope</w:t>
@@ -2150,8 +2135,8 @@
         <w:ind w:hanging="720" w:left="720"/>
         <w:rPr/>
       </w:pPr>
-      <w:bookmarkStart w:id="6" w:name="_Toc226825431"/>
-      <w:bookmarkStart w:id="7" w:name="_Toc456598589"/>
+      <w:bookmarkStart w:id="6" w:name="_Toc456598589"/>
+      <w:bookmarkStart w:id="7" w:name="_Toc226825431"/>
       <w:r>
         <w:rPr/>
         <w:t>Definitions, Acronyms, and Abbreviations</w:t>
@@ -2472,8 +2457,8 @@
         <w:ind w:hanging="720" w:left="720"/>
         <w:rPr/>
       </w:pPr>
-      <w:bookmarkStart w:id="8" w:name="_Toc456598590"/>
-      <w:bookmarkStart w:id="9" w:name="_Toc226825432"/>
+      <w:bookmarkStart w:id="8" w:name="_Toc226825432"/>
+      <w:bookmarkStart w:id="9" w:name="_Toc456598590"/>
       <w:r>
         <w:rPr/>
         <w:t>References</w:t>
@@ -2526,8 +2511,8 @@
         <w:ind w:hanging="720" w:left="720"/>
         <w:rPr/>
       </w:pPr>
-      <w:bookmarkStart w:id="10" w:name="_Toc456598591"/>
-      <w:bookmarkStart w:id="11" w:name="_Toc226825433"/>
+      <w:bookmarkStart w:id="10" w:name="_Toc226825433"/>
+      <w:bookmarkStart w:id="11" w:name="_Toc456598591"/>
       <w:r>
         <w:rPr/>
         <w:t>Overview</w:t>
@@ -3621,9 +3606,9 @@
             <wp:wrapThrough wrapText="bothSides">
               <wp:wrapPolygon edited="0">
                 <wp:start x="0" y="0"/>
-                <wp:lineTo x="21599" y="0"/>
-                <wp:lineTo x="21599" y="21599"/>
-                <wp:lineTo x="0" y="21599"/>
+                <wp:lineTo x="21597" y="0"/>
+                <wp:lineTo x="21597" y="21598"/>
+                <wp:lineTo x="0" y="21598"/>
                 <wp:lineTo x="0" y="0"/>
               </wp:wrapPolygon>
             </wp:wrapThrough>
@@ -5309,30 +5294,35 @@
                           <w:r>
                             <w:rPr>
                               <w:rStyle w:val="PageNumber"/>
+                              <w:color w:val="000000"/>
                             </w:rPr>
                             <w:fldChar w:fldCharType="begin"/>
                           </w:r>
                           <w:r>
                             <w:rPr>
                               <w:rStyle w:val="PageNumber"/>
+                              <w:color w:val="000000"/>
                             </w:rPr>
                             <w:instrText xml:space="preserve"> PAGE </w:instrText>
                           </w:r>
                           <w:r>
                             <w:rPr>
                               <w:rStyle w:val="PageNumber"/>
+                              <w:color w:val="000000"/>
                             </w:rPr>
                             <w:fldChar w:fldCharType="separate"/>
                           </w:r>
                           <w:r>
                             <w:rPr>
                               <w:rStyle w:val="PageNumber"/>
+                              <w:color w:val="000000"/>
                             </w:rPr>
                             <w:t>0</w:t>
                           </w:r>
                           <w:r>
                             <w:rPr>
                               <w:rStyle w:val="PageNumber"/>
+                              <w:color w:val="000000"/>
                             </w:rPr>
                             <w:fldChar w:fldCharType="end"/>
                           </w:r>
@@ -5350,8 +5340,8 @@
         </mc:Choice>
         <mc:Fallback>
           <w:pict>
-            <v:rect id="shape_0" fillcolor="white" stroked="f" o:allowincell="f" style="position:absolute;margin-left:0pt;margin-top:0.05pt;width:1.1pt;height:1.1pt;mso-wrap-style:square;v-text-anchor:top;mso-position-horizontal:right;mso-position-horizontal-relative:margin">
-              <v:fill o:detectmouseclick="t" type="solid" color2="black" opacity="0"/>
+            <v:rect id="shape_0" stroked="f" o:allowincell="f" style="position:absolute;margin-left:0pt;margin-top:0.05pt;width:1.1pt;height:1.1pt;mso-wrap-style:square;v-text-anchor:top;mso-position-horizontal:right;mso-position-horizontal-relative:margin">
+              <v:fill o:detectmouseclick="t" on="false"/>
               <v:stroke color="#3465a4" joinstyle="round" endcap="flat"/>
               <v:textbox>
                 <w:txbxContent>
@@ -5365,30 +5355,35 @@
                     <w:r>
                       <w:rPr>
                         <w:rStyle w:val="PageNumber"/>
+                        <w:color w:val="000000"/>
                       </w:rPr>
                       <w:fldChar w:fldCharType="begin"/>
                     </w:r>
                     <w:r>
                       <w:rPr>
                         <w:rStyle w:val="PageNumber"/>
+                        <w:color w:val="000000"/>
                       </w:rPr>
                       <w:instrText xml:space="preserve"> PAGE </w:instrText>
                     </w:r>
                     <w:r>
                       <w:rPr>
                         <w:rStyle w:val="PageNumber"/>
+                        <w:color w:val="000000"/>
                       </w:rPr>
                       <w:fldChar w:fldCharType="separate"/>
                     </w:r>
                     <w:r>
                       <w:rPr>
                         <w:rStyle w:val="PageNumber"/>
+                        <w:color w:val="000000"/>
                       </w:rPr>
                       <w:t>0</w:t>
                     </w:r>
                     <w:r>
                       <w:rPr>
                         <w:rStyle w:val="PageNumber"/>
+                        <w:color w:val="000000"/>
                       </w:rPr>
                       <w:fldChar w:fldCharType="end"/>
                     </w:r>
@@ -6077,11 +6072,7 @@
           </w:r>
           <w:r>
             <w:rPr/>
-            <w:t>Version:           1.</w:t>
-          </w:r>
-          <w:r>
-            <w:rPr/>
-            <w:t>0</w:t>
+            <w:t>Version:           1.0</w:t>
           </w:r>
         </w:p>
       </w:tc>
@@ -6171,7 +6162,11 @@
           </w:pPr>
           <w:r>
             <w:rPr/>
-            <w:t>EECS348-SAD-TermProj-v1.7</w:t>
+            <w:t>EECS348-SAD-TermProj-v1.</w:t>
+          </w:r>
+          <w:r>
+            <w:rPr/>
+            <w:t>0</w:t>
           </w:r>
         </w:p>
       </w:tc>
@@ -6259,11 +6254,7 @@
           </w:r>
           <w:r>
             <w:rPr/>
-            <w:t>Version:           1.</w:t>
-          </w:r>
-          <w:r>
-            <w:rPr/>
-            <w:t>0</w:t>
+            <w:t>Version:           1.0</w:t>
           </w:r>
         </w:p>
       </w:tc>
@@ -6353,7 +6344,11 @@
           </w:pPr>
           <w:r>
             <w:rPr/>
-            <w:t>EECS348-SAD-TermProj-v1.7</w:t>
+            <w:t>EECS348-SAD-TermProj-v1.</w:t>
+          </w:r>
+          <w:r>
+            <w:rPr/>
+            <w:t>0</w:t>
           </w:r>
         </w:p>
       </w:tc>
@@ -8039,8 +8034,8 @@
     <w:basedOn w:val="DefaultParagraphFont"/>
     <w:rPr/>
   </w:style>
-  <w:style w:type="character" w:styleId="FootnoteCharactersuser">
-    <w:name w:val="Footnote Characters (user)"/>
+  <w:style w:type="character" w:styleId="FootnoteCharacters">
+    <w:name w:val="Footnote Characters"/>
     <w:semiHidden/>
     <w:qFormat/>
     <w:rPr>
@@ -8048,8 +8043,8 @@
       <w:vertAlign w:val="superscript"/>
     </w:rPr>
   </w:style>
-  <w:style w:type="character" w:styleId="FootnoteCharacters">
-    <w:name w:val="Footnote Characters"/>
+  <w:style w:type="character" w:styleId="FootnoteCharactersuser">
+    <w:name w:val="Footnote Characters (user)"/>
     <w:qFormat/>
     <w:rPr>
       <w:sz w:val="20"/>
@@ -8533,15 +8528,15 @@
       <w:szCs w:val="24"/>
     </w:rPr>
   </w:style>
-  <w:style w:type="paragraph" w:styleId="FrameContentsuser">
-    <w:name w:val="Frame Contents (user)"/>
+  <w:style w:type="paragraph" w:styleId="FrameContents">
+    <w:name w:val="Frame Contents"/>
     <w:basedOn w:val="Normal"/>
     <w:qFormat/>
     <w:pPr/>
     <w:rPr/>
   </w:style>
-  <w:style w:type="paragraph" w:styleId="FrameContents">
-    <w:name w:val="Frame Contents"/>
+  <w:style w:type="paragraph" w:styleId="FrameContentsuser">
+    <w:name w:val="Frame Contents (user)"/>
     <w:basedOn w:val="Normal"/>
     <w:qFormat/>
     <w:pPr/>

</xml_diff>